<commit_message>
Add Topic 3: Rizal and the Philippine Revolution to Rizal study guide, expand quiz questions, and update v1.0.0 APK
</commit_message>
<xml_diff>
--- a/docs/Rizal_Midterm_Study_Guide.docx
+++ b/docs/Rizal_Midterm_Study_Guide.docx
@@ -12,21 +12,21 @@
           <w:rFonts w:ascii="Calibri" w:hAnsi="Calibri"/>
           <w:b/>
           <w:color w:val="7A1C1C"/>
-          <w:sz w:val="32"/>
+          <w:sz w:val="36"/>
         </w:rPr>
         <w:t>RIZAL'S LIFE AND WORKS (GEDC 1014)</w:t>
       </w:r>
     </w:p>
     <w:p>
       <w:pPr>
-        <w:spacing w:before="0" w:after="40"/>
+        <w:spacing w:before="0" w:after="80"/>
         <w:jc w:val="center"/>
       </w:pPr>
       <w:r>
         <w:rPr>
           <w:rFonts w:ascii="Calibri" w:hAnsi="Calibri"/>
           <w:b/>
-          <w:color w:val="282D37"/>
+          <w:color w:val="464646"/>
           <w:sz w:val="26"/>
         </w:rPr>
         <w:t>MIDTERM COMPREHENSIVE STUDY GUIDE &amp; REVIEWER</w:t>
@@ -40,12 +40,11 @@
       <w:r>
         <w:rPr>
           <w:rFonts w:ascii="Calibri" w:hAnsi="Calibri"/>
-          <w:color w:val="646E7D"/>
+          <w:i/>
+          <w:color w:val="787878"/>
           <w:sz w:val="20"/>
         </w:rPr>
-        <w:t>Source Material: JRizal-MIDTERMReviewer.docx &amp; Midterm Lecture Series</w:t>
-        <w:br/>
-        <w:t>STI West Negros University — BSIT 2G (1st Semester, SY 2026–2027)</w:t>
+        <w:t>Based on STI Official Handouts: 03 Handout 1A, 03 Handout 2A, 04 Handout 1A, 04 Handout 2A</w:t>
       </w:r>
     </w:p>
     <w:tbl>
@@ -88,7 +87,7 @@
                 <w:color w:val="FFFFFF"/>
                 <w:sz w:val="25"/>
               </w:rPr>
-              <w:t>TOPIC 1: THE PROPAGANDA MOVEMENT &amp; LA SOLIDARIDAD</w:t>
+              <w:t>TOPIC 1: RIZAL AND THE PROPAGANDA MOVEMENT (03 HANDOUT 1A)</w:t>
             </w:r>
           </w:p>
         </w:tc>
@@ -101,20 +100,20 @@
     </w:p>
     <w:p>
       <w:pPr>
-        <w:spacing w:before="0" w:after="80" w:line="312" w:lineRule="auto"/>
+        <w:spacing w:before="0" w:after="80" w:line="300" w:lineRule="auto"/>
       </w:pPr>
       <w:r>
         <w:rPr>
           <w:rFonts w:ascii="Calibri" w:hAnsi="Calibri"/>
-          <w:color w:val="232832"/>
+          <w:color w:val="323232"/>
           <w:sz w:val="22"/>
         </w:rPr>
-        <w:t>The Propaganda Movement was a peaceful campaign by Filipino reformists in Spain to demand political and social reforms for the Philippines under Spanish colonial rule.</w:t>
+        <w:t>The Propaganda Movement was an intellectual crusade launched in Spain (1880–1895) by Filipino expatriates and students seeking peaceful socio-political reforms rather than armed rebellion.</w:t>
       </w:r>
     </w:p>
     <w:p>
       <w:pPr>
-        <w:spacing w:before="0" w:after="80" w:line="312" w:lineRule="auto"/>
+        <w:spacing w:before="0" w:after="80" w:line="300" w:lineRule="auto"/>
         <w:ind w:left="360"/>
       </w:pPr>
       <w:r>
@@ -122,31 +121,31 @@
           <w:rFonts w:ascii="Calibri" w:hAnsi="Calibri"/>
           <w:b/>
           <w:color w:val="7A1C1C"/>
-          <w:sz w:val="22"/>
+          <w:sz w:val="20"/>
         </w:rPr>
-        <w:t xml:space="preserve">•  </w:t>
+        <w:t xml:space="preserve">▪  </w:t>
       </w:r>
       <w:r>
         <w:rPr>
           <w:rFonts w:ascii="Calibri" w:hAnsi="Calibri"/>
           <w:b/>
-          <w:color w:val="191E28"/>
+          <w:color w:val="1E1E1E"/>
           <w:sz w:val="22"/>
         </w:rPr>
-        <w:t xml:space="preserve">Establishment Date: </w:t>
+        <w:t xml:space="preserve">Assimilation: </w:t>
       </w:r>
       <w:r>
         <w:rPr>
           <w:rFonts w:ascii="Calibri" w:hAnsi="Calibri"/>
-          <w:color w:val="232832"/>
+          <w:color w:val="323232"/>
           <w:sz w:val="22"/>
         </w:rPr>
-        <w:t>Dec 13, 1888</w:t>
+        <w:t>Recognition of the Philippines as a regular province of Spain, rather than a colony.</w:t>
       </w:r>
     </w:p>
     <w:p>
       <w:pPr>
-        <w:spacing w:before="0" w:after="80" w:line="312" w:lineRule="auto"/>
+        <w:spacing w:before="0" w:after="80" w:line="300" w:lineRule="auto"/>
         <w:ind w:left="360"/>
       </w:pPr>
       <w:r>
@@ -154,22 +153,31 @@
           <w:rFonts w:ascii="Calibri" w:hAnsi="Calibri"/>
           <w:b/>
           <w:color w:val="7A1C1C"/>
-          <w:sz w:val="22"/>
+          <w:sz w:val="20"/>
         </w:rPr>
-        <w:t xml:space="preserve">•  </w:t>
+        <w:t xml:space="preserve">▪  </w:t>
       </w:r>
       <w:r>
         <w:rPr>
           <w:rFonts w:ascii="Calibri" w:hAnsi="Calibri"/>
-          <w:color w:val="232832"/>
+          <w:b/>
+          <w:color w:val="1E1E1E"/>
           <w:sz w:val="22"/>
         </w:rPr>
-        <w:t>Founded in Barcelona, Spain as an organ of Filipino expatriates.</w:t>
+        <w:t xml:space="preserve">Political Voice: </w:t>
+      </w:r>
+      <w:r>
+        <w:rPr>
+          <w:rFonts w:ascii="Calibri" w:hAnsi="Calibri"/>
+          <w:color w:val="323232"/>
+          <w:sz w:val="22"/>
+        </w:rPr>
+        <w:t>Filipino representation in the Spanish Cortes (Parliament).</w:t>
       </w:r>
     </w:p>
     <w:p>
       <w:pPr>
-        <w:spacing w:before="0" w:after="80" w:line="312" w:lineRule="auto"/>
+        <w:spacing w:before="0" w:after="80" w:line="300" w:lineRule="auto"/>
         <w:ind w:left="360"/>
       </w:pPr>
       <w:r>
@@ -177,31 +185,31 @@
           <w:rFonts w:ascii="Calibri" w:hAnsi="Calibri"/>
           <w:b/>
           <w:color w:val="7A1C1C"/>
-          <w:sz w:val="22"/>
+          <w:sz w:val="20"/>
         </w:rPr>
-        <w:t xml:space="preserve">•  </w:t>
+        <w:t xml:space="preserve">▪  </w:t>
       </w:r>
       <w:r>
         <w:rPr>
           <w:rFonts w:ascii="Calibri" w:hAnsi="Calibri"/>
           <w:b/>
-          <w:color w:val="191E28"/>
+          <w:color w:val="1E1E1E"/>
           <w:sz w:val="22"/>
         </w:rPr>
-        <w:t xml:space="preserve">First Publication: </w:t>
+        <w:t xml:space="preserve">Equality: </w:t>
       </w:r>
       <w:r>
         <w:rPr>
           <w:rFonts w:ascii="Calibri" w:hAnsi="Calibri"/>
-          <w:color w:val="232832"/>
+          <w:color w:val="323232"/>
           <w:sz w:val="22"/>
         </w:rPr>
-        <w:t>Feb 15, 1889</w:t>
+        <w:t>Legal equality before the law for Filipinos and Spaniards alike.</w:t>
       </w:r>
     </w:p>
     <w:p>
       <w:pPr>
-        <w:spacing w:before="0" w:after="80" w:line="312" w:lineRule="auto"/>
+        <w:spacing w:before="0" w:after="80" w:line="300" w:lineRule="auto"/>
         <w:ind w:left="360"/>
       </w:pPr>
       <w:r>
@@ -209,22 +217,31 @@
           <w:rFonts w:ascii="Calibri" w:hAnsi="Calibri"/>
           <w:b/>
           <w:color w:val="7A1C1C"/>
-          <w:sz w:val="22"/>
+          <w:sz w:val="20"/>
         </w:rPr>
-        <w:t xml:space="preserve">•  </w:t>
+        <w:t xml:space="preserve">▪  </w:t>
       </w:r>
       <w:r>
         <w:rPr>
           <w:rFonts w:ascii="Calibri" w:hAnsi="Calibri"/>
-          <w:color w:val="232832"/>
+          <w:b/>
+          <w:color w:val="1E1E1E"/>
           <w:sz w:val="22"/>
         </w:rPr>
-        <w:t>First issue of the fortnightly newspaper La Solidaridad released under Graciano Lopez Jaena.</w:t>
+        <w:t xml:space="preserve">Secularization: </w:t>
+      </w:r>
+      <w:r>
+        <w:rPr>
+          <w:rFonts w:ascii="Calibri" w:hAnsi="Calibri"/>
+          <w:color w:val="323232"/>
+          <w:sz w:val="22"/>
+        </w:rPr>
+        <w:t>Secularization of parishes and the expulsion of abusive Spanish friars.</w:t>
       </w:r>
     </w:p>
     <w:p>
       <w:pPr>
-        <w:spacing w:before="0" w:after="80" w:line="312" w:lineRule="auto"/>
+        <w:spacing w:before="0" w:after="80" w:line="300" w:lineRule="auto"/>
         <w:ind w:left="360"/>
       </w:pPr>
       <w:r>
@@ -232,122 +249,26 @@
           <w:rFonts w:ascii="Calibri" w:hAnsi="Calibri"/>
           <w:b/>
           <w:color w:val="7A1C1C"/>
-          <w:sz w:val="22"/>
+          <w:sz w:val="20"/>
         </w:rPr>
-        <w:t xml:space="preserve">•  </w:t>
+        <w:t xml:space="preserve">▪  </w:t>
       </w:r>
       <w:r>
         <w:rPr>
           <w:rFonts w:ascii="Calibri" w:hAnsi="Calibri"/>
           <w:b/>
-          <w:color w:val="191E28"/>
+          <w:color w:val="1E1E1E"/>
           <w:sz w:val="22"/>
         </w:rPr>
-        <w:t xml:space="preserve">Core Demand 1: </w:t>
+        <w:t xml:space="preserve">Human Rights: </w:t>
       </w:r>
       <w:r>
         <w:rPr>
           <w:rFonts w:ascii="Calibri" w:hAnsi="Calibri"/>
-          <w:color w:val="232832"/>
+          <w:color w:val="323232"/>
           <w:sz w:val="22"/>
         </w:rPr>
-        <w:t>Equality before the law between Filipinos and Spaniards.</w:t>
-      </w:r>
-    </w:p>
-    <w:p>
-      <w:pPr>
-        <w:spacing w:before="0" w:after="80" w:line="312" w:lineRule="auto"/>
-        <w:ind w:left="360"/>
-      </w:pPr>
-      <w:r>
-        <w:rPr>
-          <w:rFonts w:ascii="Calibri" w:hAnsi="Calibri"/>
-          <w:b/>
-          <w:color w:val="7A1C1C"/>
-          <w:sz w:val="22"/>
-        </w:rPr>
-        <w:t xml:space="preserve">•  </w:t>
-      </w:r>
-      <w:r>
-        <w:rPr>
-          <w:rFonts w:ascii="Calibri" w:hAnsi="Calibri"/>
-          <w:b/>
-          <w:color w:val="191E28"/>
-          <w:sz w:val="22"/>
-        </w:rPr>
-        <w:t xml:space="preserve">Core Demand 2: </w:t>
-      </w:r>
-      <w:r>
-        <w:rPr>
-          <w:rFonts w:ascii="Calibri" w:hAnsi="Calibri"/>
-          <w:color w:val="232832"/>
-          <w:sz w:val="22"/>
-        </w:rPr>
-        <w:t>Filipino representation in the Spanish Cortes (Parliament).</w:t>
-      </w:r>
-    </w:p>
-    <w:p>
-      <w:pPr>
-        <w:spacing w:before="0" w:after="80" w:line="312" w:lineRule="auto"/>
-        <w:ind w:left="360"/>
-      </w:pPr>
-      <w:r>
-        <w:rPr>
-          <w:rFonts w:ascii="Calibri" w:hAnsi="Calibri"/>
-          <w:b/>
-          <w:color w:val="7A1C1C"/>
-          <w:sz w:val="22"/>
-        </w:rPr>
-        <w:t xml:space="preserve">•  </w:t>
-      </w:r>
-      <w:r>
-        <w:rPr>
-          <w:rFonts w:ascii="Calibri" w:hAnsi="Calibri"/>
-          <w:b/>
-          <w:color w:val="191E28"/>
-          <w:sz w:val="22"/>
-        </w:rPr>
-        <w:t xml:space="preserve">Core Demand 3: </w:t>
-      </w:r>
-      <w:r>
-        <w:rPr>
-          <w:rFonts w:ascii="Calibri" w:hAnsi="Calibri"/>
-          <w:color w:val="232832"/>
-          <w:sz w:val="22"/>
-        </w:rPr>
-        <w:t>Secularization of parishes and expulsion of abusive friars.</w:t>
-      </w:r>
-    </w:p>
-    <w:p>
-      <w:pPr>
-        <w:spacing w:before="0" w:after="80" w:line="312" w:lineRule="auto"/>
-        <w:ind w:left="360"/>
-      </w:pPr>
-      <w:r>
-        <w:rPr>
-          <w:rFonts w:ascii="Calibri" w:hAnsi="Calibri"/>
-          <w:b/>
-          <w:color w:val="7A1C1C"/>
-          <w:sz w:val="22"/>
-        </w:rPr>
-        <w:t xml:space="preserve">•  </w:t>
-      </w:r>
-      <w:r>
-        <w:rPr>
-          <w:rFonts w:ascii="Calibri" w:hAnsi="Calibri"/>
-          <w:b/>
-          <w:color w:val="191E28"/>
-          <w:sz w:val="22"/>
-        </w:rPr>
-        <w:t xml:space="preserve">Core Demand 4: </w:t>
-      </w:r>
-      <w:r>
-        <w:rPr>
-          <w:rFonts w:ascii="Calibri" w:hAnsi="Calibri"/>
-          <w:color w:val="232832"/>
-          <w:sz w:val="22"/>
-        </w:rPr>
-        <w:t>Freedom of speech, press, and peaceful assembly.</w:t>
+        <w:t>Guaranteed basic civil liberties (speech, press, assembly, and petition for redress).</w:t>
       </w:r>
     </w:p>
     <w:tbl>
@@ -389,16 +310,16 @@
                 <w:color w:val="7A1C1C"/>
                 <w:sz w:val="22"/>
               </w:rPr>
-              <w:t>KEY DEFINITION: La Solidaridad</w:t>
+              <w:t>KEY DEFINITION: Ilustrados</w:t>
               <w:br/>
             </w:r>
             <w:r>
               <w:rPr>
                 <w:rFonts w:ascii="Calibri" w:hAnsi="Calibri"/>
-                <w:color w:val="232832"/>
+                <w:color w:val="282828"/>
                 <w:sz w:val="21"/>
               </w:rPr>
-              <w:t>The official newspaper and propaganda organ established by Filipino reformists in Spain to expose colonial abuses, advocate for Philippine representation in the Spanish Cortes, and push for assimilation as a regular Spanish province.</w:t>
+              <w:t>The highly educated, middle-class Filipino youth who studied in Manila and European universities during the late 19th century. They utilized intellectual arguments, literature, and journalism to expose colonial abuses.</w:t>
             </w:r>
           </w:p>
         </w:tc>
@@ -408,6 +329,143 @@
       <w:pPr>
         <w:spacing w:before="60" w:after="60" w:line="240" w:lineRule="auto"/>
       </w:pPr>
+    </w:p>
+    <w:p>
+      <w:pPr>
+        <w:spacing w:before="0" w:after="80" w:line="300" w:lineRule="auto"/>
+      </w:pPr>
+      <w:r>
+        <w:rPr>
+          <w:rFonts w:ascii="Calibri" w:hAnsi="Calibri"/>
+          <w:b/>
+          <w:color w:val="1E1E1E"/>
+          <w:sz w:val="22"/>
+        </w:rPr>
+        <w:t xml:space="preserve">The Propaganda Newspaper: </w:t>
+      </w:r>
+      <w:r>
+        <w:rPr>
+          <w:rFonts w:ascii="Calibri" w:hAnsi="Calibri"/>
+          <w:color w:val="323232"/>
+          <w:sz w:val="22"/>
+        </w:rPr>
+        <w:t>Key facts about La Solidaridad (The Official Propaganda Organ):</w:t>
+      </w:r>
+    </w:p>
+    <w:p>
+      <w:pPr>
+        <w:spacing w:before="0" w:after="80" w:line="300" w:lineRule="auto"/>
+        <w:ind w:left="360"/>
+      </w:pPr>
+      <w:r>
+        <w:rPr>
+          <w:rFonts w:ascii="Calibri" w:hAnsi="Calibri"/>
+          <w:b/>
+          <w:color w:val="7A1C1C"/>
+          <w:sz w:val="20"/>
+        </w:rPr>
+        <w:t xml:space="preserve">▪  </w:t>
+      </w:r>
+      <w:r>
+        <w:rPr>
+          <w:rFonts w:ascii="Calibri" w:hAnsi="Calibri"/>
+          <w:color w:val="323232"/>
+          <w:sz w:val="22"/>
+        </w:rPr>
+        <w:t>Founded in Barcelona, Spain; first issue printed on February 15, 1889.</w:t>
+      </w:r>
+    </w:p>
+    <w:p>
+      <w:pPr>
+        <w:spacing w:before="0" w:after="80" w:line="300" w:lineRule="auto"/>
+        <w:ind w:left="360"/>
+      </w:pPr>
+      <w:r>
+        <w:rPr>
+          <w:rFonts w:ascii="Calibri" w:hAnsi="Calibri"/>
+          <w:b/>
+          <w:color w:val="7A1C1C"/>
+          <w:sz w:val="20"/>
+        </w:rPr>
+        <w:t xml:space="preserve">▪  </w:t>
+      </w:r>
+      <w:r>
+        <w:rPr>
+          <w:rFonts w:ascii="Calibri" w:hAnsi="Calibri"/>
+          <w:color w:val="323232"/>
+          <w:sz w:val="22"/>
+        </w:rPr>
+        <w:t>Graciano Lopez Jaena served as the first editor-in-chief.</w:t>
+      </w:r>
+    </w:p>
+    <w:p>
+      <w:pPr>
+        <w:spacing w:before="0" w:after="80" w:line="300" w:lineRule="auto"/>
+        <w:ind w:left="360"/>
+      </w:pPr>
+      <w:r>
+        <w:rPr>
+          <w:rFonts w:ascii="Calibri" w:hAnsi="Calibri"/>
+          <w:b/>
+          <w:color w:val="7A1C1C"/>
+          <w:sz w:val="20"/>
+        </w:rPr>
+        <w:t xml:space="preserve">▪  </w:t>
+      </w:r>
+      <w:r>
+        <w:rPr>
+          <w:rFonts w:ascii="Calibri" w:hAnsi="Calibri"/>
+          <w:color w:val="323232"/>
+          <w:sz w:val="22"/>
+        </w:rPr>
+        <w:t>Marcelo H. del Pilar took over management and relocated the headquarters to Madrid.</w:t>
+      </w:r>
+    </w:p>
+    <w:p>
+      <w:pPr>
+        <w:spacing w:before="0" w:after="80" w:line="300" w:lineRule="auto"/>
+        <w:ind w:left="360"/>
+      </w:pPr>
+      <w:r>
+        <w:rPr>
+          <w:rFonts w:ascii="Calibri" w:hAnsi="Calibri"/>
+          <w:b/>
+          <w:color w:val="7A1C1C"/>
+          <w:sz w:val="20"/>
+        </w:rPr>
+        <w:t xml:space="preserve">▪  </w:t>
+      </w:r>
+      <w:r>
+        <w:rPr>
+          <w:rFonts w:ascii="Calibri" w:hAnsi="Calibri"/>
+          <w:color w:val="323232"/>
+          <w:sz w:val="22"/>
+        </w:rPr>
+        <w:t>Jose Rizal contributed major political essays, including 'The Indolence of the Filipinos' and 'The Philippines a Century Hence.'</w:t>
+      </w:r>
+    </w:p>
+    <w:p>
+      <w:pPr>
+        <w:spacing w:before="0" w:after="80" w:line="300" w:lineRule="auto"/>
+        <w:ind w:left="360"/>
+      </w:pPr>
+      <w:r>
+        <w:rPr>
+          <w:rFonts w:ascii="Calibri" w:hAnsi="Calibri"/>
+          <w:b/>
+          <w:color w:val="7A1C1C"/>
+          <w:sz w:val="20"/>
+        </w:rPr>
+        <w:t xml:space="preserve">▪  </w:t>
+      </w:r>
+      <w:r>
+        <w:rPr>
+          <w:rFonts w:ascii="Calibri" w:hAnsi="Calibri"/>
+          <w:color w:val="323232"/>
+          <w:sz w:val="22"/>
+        </w:rPr>
+        <w:t>The paper ceased publication on November 15, 1895 due to insufficient funding and internal disagreements.</w:t>
+      </w:r>
     </w:p>
     <w:tbl>
       <w:tblPr>
@@ -427,31 +485,24 @@
             <w:tcW w:type="dxa" w:w="2592"/>
             <w:shd w:fill="7A1C1C"/>
             <w:tcMar>
-              <w:top w:w="100" w:type="dxa"/>
-              <w:bottom w:w="100" w:type="dxa"/>
-              <w:left w:w="130" w:type="dxa"/>
-              <w:right w:w="130" w:type="dxa"/>
+              <w:top w:w="120" w:type="dxa"/>
+              <w:bottom w:w="120" w:type="dxa"/>
+              <w:left w:w="140" w:type="dxa"/>
+              <w:right w:w="140" w:type="dxa"/>
             </w:tcMar>
-            <w:tcBorders>
-              <w:top w:val="single" w:sz="4" w:space="0" w:color="D9B2B2"/>
-              <w:left w:val="single" w:sz="4" w:space="0" w:color="D9B2B2"/>
-              <w:bottom w:val="single" w:sz="4" w:space="0" w:color="D9B2B2"/>
-              <w:right w:val="single" w:sz="4" w:space="0" w:color="D9B2B2"/>
-            </w:tcBorders>
           </w:tcPr>
           <w:p>
             <w:pPr>
-              <w:spacing w:before="0" w:after="0"/>
-              <w:jc w:val="left"/>
+              <w:spacing w:before="0" w:after="0" w:line="276" w:lineRule="auto"/>
             </w:pPr>
             <w:r>
               <w:rPr>
                 <w:rFonts w:ascii="Calibri" w:hAnsi="Calibri"/>
                 <w:b/>
                 <w:color w:val="FFFFFF"/>
-                <w:sz w:val="20"/>
+                <w:sz w:val="21"/>
               </w:rPr>
-              <w:t>Propagandist / Leader</w:t>
+              <w:t>Propagandist</w:t>
             </w:r>
           </w:p>
         </w:tc>
@@ -460,31 +511,24 @@
             <w:tcW w:type="dxa" w:w="4608"/>
             <w:shd w:fill="7A1C1C"/>
             <w:tcMar>
-              <w:top w:w="100" w:type="dxa"/>
-              <w:bottom w:w="100" w:type="dxa"/>
-              <w:left w:w="130" w:type="dxa"/>
-              <w:right w:w="130" w:type="dxa"/>
+              <w:top w:w="120" w:type="dxa"/>
+              <w:bottom w:w="120" w:type="dxa"/>
+              <w:left w:w="140" w:type="dxa"/>
+              <w:right w:w="140" w:type="dxa"/>
             </w:tcMar>
-            <w:tcBorders>
-              <w:top w:val="single" w:sz="4" w:space="0" w:color="D9B2B2"/>
-              <w:left w:val="single" w:sz="4" w:space="0" w:color="D9B2B2"/>
-              <w:bottom w:val="single" w:sz="4" w:space="0" w:color="D9B2B2"/>
-              <w:right w:val="single" w:sz="4" w:space="0" w:color="D9B2B2"/>
-            </w:tcBorders>
           </w:tcPr>
           <w:p>
             <w:pPr>
-              <w:spacing w:before="0" w:after="0"/>
-              <w:jc w:val="left"/>
+              <w:spacing w:before="0" w:after="0" w:line="276" w:lineRule="auto"/>
             </w:pPr>
             <w:r>
               <w:rPr>
                 <w:rFonts w:ascii="Calibri" w:hAnsi="Calibri"/>
                 <w:b/>
                 <w:color w:val="FFFFFF"/>
-                <w:sz w:val="20"/>
+                <w:sz w:val="21"/>
               </w:rPr>
-              <w:t>Role &amp; Major Contributions</w:t>
+              <w:t>Role in Movement / Major Contribution</w:t>
             </w:r>
           </w:p>
         </w:tc>
@@ -493,31 +537,24 @@
             <w:tcW w:type="dxa" w:w="2160"/>
             <w:shd w:fill="7A1C1C"/>
             <w:tcMar>
-              <w:top w:w="100" w:type="dxa"/>
-              <w:bottom w:w="100" w:type="dxa"/>
-              <w:left w:w="130" w:type="dxa"/>
-              <w:right w:w="130" w:type="dxa"/>
+              <w:top w:w="120" w:type="dxa"/>
+              <w:bottom w:w="120" w:type="dxa"/>
+              <w:left w:w="140" w:type="dxa"/>
+              <w:right w:w="140" w:type="dxa"/>
             </w:tcMar>
-            <w:tcBorders>
-              <w:top w:val="single" w:sz="4" w:space="0" w:color="D9B2B2"/>
-              <w:left w:val="single" w:sz="4" w:space="0" w:color="D9B2B2"/>
-              <w:bottom w:val="single" w:sz="4" w:space="0" w:color="D9B2B2"/>
-              <w:right w:val="single" w:sz="4" w:space="0" w:color="D9B2B2"/>
-            </w:tcBorders>
           </w:tcPr>
           <w:p>
             <w:pPr>
-              <w:spacing w:before="0" w:after="0"/>
-              <w:jc w:val="left"/>
+              <w:spacing w:before="0" w:after="0" w:line="276" w:lineRule="auto"/>
             </w:pPr>
             <w:r>
               <w:rPr>
                 <w:rFonts w:ascii="Calibri" w:hAnsi="Calibri"/>
                 <w:b/>
                 <w:color w:val="FFFFFF"/>
-                <w:sz w:val="20"/>
+                <w:sz w:val="21"/>
               </w:rPr>
-              <w:t>Known Pen Names</w:t>
+              <w:t>Pen Names</w:t>
             </w:r>
           </w:p>
         </w:tc>
@@ -528,30 +565,29 @@
             <w:tcW w:type="dxa" w:w="2592"/>
             <w:shd w:fill="FFFFFF"/>
             <w:tcMar>
-              <w:top w:w="80" w:type="dxa"/>
-              <w:bottom w:w="80" w:type="dxa"/>
+              <w:top w:w="100" w:type="dxa"/>
+              <w:bottom w:w="100" w:type="dxa"/>
               <w:left w:w="130" w:type="dxa"/>
               <w:right w:w="130" w:type="dxa"/>
             </w:tcMar>
             <w:tcBorders>
               <w:top w:val="single" w:sz="4" w:space="0" w:color="D9B2B2"/>
-              <w:left w:val="single" w:sz="4" w:space="0" w:color="D9B2B2"/>
+              <w:left w:val="none"/>
               <w:bottom w:val="single" w:sz="4" w:space="0" w:color="D9B2B2"/>
-              <w:right w:val="single" w:sz="4" w:space="0" w:color="D9B2B2"/>
+              <w:right w:val="none"/>
             </w:tcBorders>
           </w:tcPr>
           <w:p>
             <w:pPr>
-              <w:spacing w:before="0" w:after="0" w:line="288" w:lineRule="auto"/>
-              <w:jc w:val="left"/>
+              <w:spacing w:before="0" w:after="0" w:line="276" w:lineRule="auto"/>
             </w:pPr>
             <w:r>
               <w:rPr>
                 <w:rFonts w:ascii="Calibri" w:hAnsi="Calibri"/>
-                <w:color w:val="232832"/>
-                <w:sz w:val="19"/>
+                <w:color w:val="232323"/>
+                <w:sz w:val="20"/>
               </w:rPr>
-              <w:t>Jose Rizal</w:t>
+              <w:t>Dr. Jose Rizal</w:t>
             </w:r>
           </w:p>
         </w:tc>
@@ -560,30 +596,29 @@
             <w:tcW w:type="dxa" w:w="4608"/>
             <w:shd w:fill="FFFFFF"/>
             <w:tcMar>
-              <w:top w:w="80" w:type="dxa"/>
-              <w:bottom w:w="80" w:type="dxa"/>
+              <w:top w:w="100" w:type="dxa"/>
+              <w:bottom w:w="100" w:type="dxa"/>
               <w:left w:w="130" w:type="dxa"/>
               <w:right w:w="130" w:type="dxa"/>
             </w:tcMar>
             <w:tcBorders>
               <w:top w:val="single" w:sz="4" w:space="0" w:color="D9B2B2"/>
-              <w:left w:val="single" w:sz="4" w:space="0" w:color="D9B2B2"/>
+              <w:left w:val="none"/>
               <w:bottom w:val="single" w:sz="4" w:space="0" w:color="D9B2B2"/>
-              <w:right w:val="single" w:sz="4" w:space="0" w:color="D9B2B2"/>
+              <w:right w:val="none"/>
             </w:tcBorders>
           </w:tcPr>
           <w:p>
             <w:pPr>
-              <w:spacing w:before="0" w:after="0" w:line="288" w:lineRule="auto"/>
-              <w:jc w:val="left"/>
+              <w:spacing w:before="0" w:after="0" w:line="276" w:lineRule="auto"/>
             </w:pPr>
             <w:r>
               <w:rPr>
                 <w:rFonts w:ascii="Calibri" w:hAnsi="Calibri"/>
-                <w:color w:val="232832"/>
-                <w:sz w:val="19"/>
+                <w:color w:val="232323"/>
+                <w:sz w:val="20"/>
               </w:rPr>
-              <w:t>Author of Noli Me Tangere and El Filibusterismo; leading intellectual voice of reform</w:t>
+              <w:t>Leading intellectual contributor; novelist (Noli &amp; El Fili); moral conscience of the expatriates</w:t>
             </w:r>
           </w:p>
         </w:tc>
@@ -592,30 +627,29 @@
             <w:tcW w:type="dxa" w:w="2160"/>
             <w:shd w:fill="FFFFFF"/>
             <w:tcMar>
-              <w:top w:w="80" w:type="dxa"/>
-              <w:bottom w:w="80" w:type="dxa"/>
+              <w:top w:w="100" w:type="dxa"/>
+              <w:bottom w:w="100" w:type="dxa"/>
               <w:left w:w="130" w:type="dxa"/>
               <w:right w:w="130" w:type="dxa"/>
             </w:tcMar>
             <w:tcBorders>
               <w:top w:val="single" w:sz="4" w:space="0" w:color="D9B2B2"/>
-              <w:left w:val="single" w:sz="4" w:space="0" w:color="D9B2B2"/>
+              <w:left w:val="none"/>
               <w:bottom w:val="single" w:sz="4" w:space="0" w:color="D9B2B2"/>
-              <w:right w:val="single" w:sz="4" w:space="0" w:color="D9B2B2"/>
+              <w:right w:val="none"/>
             </w:tcBorders>
           </w:tcPr>
           <w:p>
             <w:pPr>
-              <w:spacing w:before="0" w:after="0" w:line="288" w:lineRule="auto"/>
-              <w:jc w:val="left"/>
+              <w:spacing w:before="0" w:after="0" w:line="276" w:lineRule="auto"/>
             </w:pPr>
             <w:r>
               <w:rPr>
                 <w:rFonts w:ascii="Calibri" w:hAnsi="Calibri"/>
-                <w:color w:val="232832"/>
-                <w:sz w:val="19"/>
+                <w:color w:val="232323"/>
+                <w:sz w:val="20"/>
               </w:rPr>
-              <w:t>Dimasalang, Laong Laan</w:t>
+              <w:t>Laong Laan, Dimasalang</w:t>
             </w:r>
           </w:p>
         </w:tc>
@@ -624,30 +658,29 @@
         <w:tc>
           <w:tcPr>
             <w:tcW w:type="dxa" w:w="2592"/>
-            <w:shd w:fill="FAF5F5"/>
+            <w:shd w:fill="FDF7F7"/>
             <w:tcMar>
-              <w:top w:w="80" w:type="dxa"/>
-              <w:bottom w:w="80" w:type="dxa"/>
+              <w:top w:w="100" w:type="dxa"/>
+              <w:bottom w:w="100" w:type="dxa"/>
               <w:left w:w="130" w:type="dxa"/>
               <w:right w:w="130" w:type="dxa"/>
             </w:tcMar>
             <w:tcBorders>
               <w:top w:val="single" w:sz="4" w:space="0" w:color="D9B2B2"/>
-              <w:left w:val="single" w:sz="4" w:space="0" w:color="D9B2B2"/>
+              <w:left w:val="none"/>
               <w:bottom w:val="single" w:sz="4" w:space="0" w:color="D9B2B2"/>
-              <w:right w:val="single" w:sz="4" w:space="0" w:color="D9B2B2"/>
+              <w:right w:val="none"/>
             </w:tcBorders>
           </w:tcPr>
           <w:p>
             <w:pPr>
-              <w:spacing w:before="0" w:after="0" w:line="288" w:lineRule="auto"/>
-              <w:jc w:val="left"/>
+              <w:spacing w:before="0" w:after="0" w:line="276" w:lineRule="auto"/>
             </w:pPr>
             <w:r>
               <w:rPr>
                 <w:rFonts w:ascii="Calibri" w:hAnsi="Calibri"/>
-                <w:color w:val="232832"/>
-                <w:sz w:val="19"/>
+                <w:color w:val="232323"/>
+                <w:sz w:val="20"/>
               </w:rPr>
               <w:t>Marcelo H. del Pilar</w:t>
             </w:r>
@@ -656,62 +689,60 @@
         <w:tc>
           <w:tcPr>
             <w:tcW w:type="dxa" w:w="4608"/>
-            <w:shd w:fill="FAF5F5"/>
+            <w:shd w:fill="FDF7F7"/>
             <w:tcMar>
-              <w:top w:w="80" w:type="dxa"/>
-              <w:bottom w:w="80" w:type="dxa"/>
+              <w:top w:w="100" w:type="dxa"/>
+              <w:bottom w:w="100" w:type="dxa"/>
               <w:left w:w="130" w:type="dxa"/>
               <w:right w:w="130" w:type="dxa"/>
             </w:tcMar>
             <w:tcBorders>
               <w:top w:val="single" w:sz="4" w:space="0" w:color="D9B2B2"/>
-              <w:left w:val="single" w:sz="4" w:space="0" w:color="D9B2B2"/>
+              <w:left w:val="none"/>
               <w:bottom w:val="single" w:sz="4" w:space="0" w:color="D9B2B2"/>
-              <w:right w:val="single" w:sz="4" w:space="0" w:color="D9B2B2"/>
+              <w:right w:val="none"/>
             </w:tcBorders>
           </w:tcPr>
           <w:p>
             <w:pPr>
-              <w:spacing w:before="0" w:after="0" w:line="288" w:lineRule="auto"/>
-              <w:jc w:val="left"/>
+              <w:spacing w:before="0" w:after="0" w:line="276" w:lineRule="auto"/>
             </w:pPr>
             <w:r>
               <w:rPr>
                 <w:rFonts w:ascii="Calibri" w:hAnsi="Calibri"/>
-                <w:color w:val="232832"/>
-                <w:sz w:val="19"/>
+                <w:color w:val="232323"/>
+                <w:sz w:val="20"/>
               </w:rPr>
-              <w:t>Master polemicist, lawyer, second editor of La Solidaridad; took over in Madrid</w:t>
+              <w:t>Master polemicist; second editor of La Solidaridad; established Spanish-Filipino associations in Madrid</w:t>
             </w:r>
           </w:p>
         </w:tc>
         <w:tc>
           <w:tcPr>
             <w:tcW w:type="dxa" w:w="2160"/>
-            <w:shd w:fill="FAF5F5"/>
+            <w:shd w:fill="FDF7F7"/>
             <w:tcMar>
-              <w:top w:w="80" w:type="dxa"/>
-              <w:bottom w:w="80" w:type="dxa"/>
+              <w:top w:w="100" w:type="dxa"/>
+              <w:bottom w:w="100" w:type="dxa"/>
               <w:left w:w="130" w:type="dxa"/>
               <w:right w:w="130" w:type="dxa"/>
             </w:tcMar>
             <w:tcBorders>
               <w:top w:val="single" w:sz="4" w:space="0" w:color="D9B2B2"/>
-              <w:left w:val="single" w:sz="4" w:space="0" w:color="D9B2B2"/>
+              <w:left w:val="none"/>
               <w:bottom w:val="single" w:sz="4" w:space="0" w:color="D9B2B2"/>
-              <w:right w:val="single" w:sz="4" w:space="0" w:color="D9B2B2"/>
+              <w:right w:val="none"/>
             </w:tcBorders>
           </w:tcPr>
           <w:p>
             <w:pPr>
-              <w:spacing w:before="0" w:after="0" w:line="288" w:lineRule="auto"/>
-              <w:jc w:val="left"/>
+              <w:spacing w:before="0" w:after="0" w:line="276" w:lineRule="auto"/>
             </w:pPr>
             <w:r>
               <w:rPr>
                 <w:rFonts w:ascii="Calibri" w:hAnsi="Calibri"/>
-                <w:color w:val="232832"/>
-                <w:sz w:val="19"/>
+                <w:color w:val="232323"/>
+                <w:sz w:val="20"/>
               </w:rPr>
               <w:t>Plaridel, Dolores Manapat</w:t>
             </w:r>
@@ -724,28 +755,27 @@
             <w:tcW w:type="dxa" w:w="2592"/>
             <w:shd w:fill="FFFFFF"/>
             <w:tcMar>
-              <w:top w:w="80" w:type="dxa"/>
-              <w:bottom w:w="80" w:type="dxa"/>
+              <w:top w:w="100" w:type="dxa"/>
+              <w:bottom w:w="100" w:type="dxa"/>
               <w:left w:w="130" w:type="dxa"/>
               <w:right w:w="130" w:type="dxa"/>
             </w:tcMar>
             <w:tcBorders>
               <w:top w:val="single" w:sz="4" w:space="0" w:color="D9B2B2"/>
-              <w:left w:val="single" w:sz="4" w:space="0" w:color="D9B2B2"/>
+              <w:left w:val="none"/>
               <w:bottom w:val="single" w:sz="4" w:space="0" w:color="D9B2B2"/>
-              <w:right w:val="single" w:sz="4" w:space="0" w:color="D9B2B2"/>
+              <w:right w:val="none"/>
             </w:tcBorders>
           </w:tcPr>
           <w:p>
             <w:pPr>
-              <w:spacing w:before="0" w:after="0" w:line="288" w:lineRule="auto"/>
-              <w:jc w:val="left"/>
+              <w:spacing w:before="0" w:after="0" w:line="276" w:lineRule="auto"/>
             </w:pPr>
             <w:r>
               <w:rPr>
                 <w:rFonts w:ascii="Calibri" w:hAnsi="Calibri"/>
-                <w:color w:val="232832"/>
-                <w:sz w:val="19"/>
+                <w:color w:val="232323"/>
+                <w:sz w:val="20"/>
               </w:rPr>
               <w:t>Graciano Lopez Jaena</w:t>
             </w:r>
@@ -756,30 +786,29 @@
             <w:tcW w:type="dxa" w:w="4608"/>
             <w:shd w:fill="FFFFFF"/>
             <w:tcMar>
-              <w:top w:w="80" w:type="dxa"/>
-              <w:bottom w:w="80" w:type="dxa"/>
+              <w:top w:w="100" w:type="dxa"/>
+              <w:bottom w:w="100" w:type="dxa"/>
               <w:left w:w="130" w:type="dxa"/>
               <w:right w:w="130" w:type="dxa"/>
             </w:tcMar>
             <w:tcBorders>
               <w:top w:val="single" w:sz="4" w:space="0" w:color="D9B2B2"/>
-              <w:left w:val="single" w:sz="4" w:space="0" w:color="D9B2B2"/>
+              <w:left w:val="none"/>
               <w:bottom w:val="single" w:sz="4" w:space="0" w:color="D9B2B2"/>
-              <w:right w:val="single" w:sz="4" w:space="0" w:color="D9B2B2"/>
+              <w:right w:val="none"/>
             </w:tcBorders>
           </w:tcPr>
           <w:p>
             <w:pPr>
-              <w:spacing w:before="0" w:after="0" w:line="288" w:lineRule="auto"/>
-              <w:jc w:val="left"/>
+              <w:spacing w:before="0" w:after="0" w:line="276" w:lineRule="auto"/>
             </w:pPr>
             <w:r>
               <w:rPr>
                 <w:rFonts w:ascii="Calibri" w:hAnsi="Calibri"/>
-                <w:color w:val="232832"/>
-                <w:sz w:val="19"/>
+                <w:color w:val="232323"/>
+                <w:sz w:val="20"/>
               </w:rPr>
-              <w:t>First editor of La Solidaridad; prominent orator; author of Fray Botod</w:t>
+              <w:t>Fray Botod author; gifted orator; founded La Solidaridad in Barcelona (Feb 15, 1889)</w:t>
             </w:r>
           </w:p>
         </w:tc>
@@ -788,28 +817,27 @@
             <w:tcW w:type="dxa" w:w="2160"/>
             <w:shd w:fill="FFFFFF"/>
             <w:tcMar>
-              <w:top w:w="80" w:type="dxa"/>
-              <w:bottom w:w="80" w:type="dxa"/>
+              <w:top w:w="100" w:type="dxa"/>
+              <w:bottom w:w="100" w:type="dxa"/>
               <w:left w:w="130" w:type="dxa"/>
               <w:right w:w="130" w:type="dxa"/>
             </w:tcMar>
             <w:tcBorders>
               <w:top w:val="single" w:sz="4" w:space="0" w:color="D9B2B2"/>
-              <w:left w:val="single" w:sz="4" w:space="0" w:color="D9B2B2"/>
+              <w:left w:val="none"/>
               <w:bottom w:val="single" w:sz="4" w:space="0" w:color="D9B2B2"/>
-              <w:right w:val="single" w:sz="4" w:space="0" w:color="D9B2B2"/>
+              <w:right w:val="none"/>
             </w:tcBorders>
           </w:tcPr>
           <w:p>
             <w:pPr>
-              <w:spacing w:before="0" w:after="0" w:line="288" w:lineRule="auto"/>
-              <w:jc w:val="left"/>
+              <w:spacing w:before="0" w:after="0" w:line="276" w:lineRule="auto"/>
             </w:pPr>
             <w:r>
               <w:rPr>
                 <w:rFonts w:ascii="Calibri" w:hAnsi="Calibri"/>
-                <w:color w:val="232832"/>
-                <w:sz w:val="19"/>
+                <w:color w:val="232323"/>
+                <w:sz w:val="20"/>
               </w:rPr>
               <w:t>Diego Laura</w:t>
             </w:r>
@@ -820,30 +848,29 @@
         <w:tc>
           <w:tcPr>
             <w:tcW w:type="dxa" w:w="2592"/>
-            <w:shd w:fill="FAF5F5"/>
+            <w:shd w:fill="FDF7F7"/>
             <w:tcMar>
-              <w:top w:w="80" w:type="dxa"/>
-              <w:bottom w:w="80" w:type="dxa"/>
+              <w:top w:w="100" w:type="dxa"/>
+              <w:bottom w:w="100" w:type="dxa"/>
               <w:left w:w="130" w:type="dxa"/>
               <w:right w:w="130" w:type="dxa"/>
             </w:tcMar>
             <w:tcBorders>
               <w:top w:val="single" w:sz="4" w:space="0" w:color="D9B2B2"/>
-              <w:left w:val="single" w:sz="4" w:space="0" w:color="D9B2B2"/>
+              <w:left w:val="none"/>
               <w:bottom w:val="single" w:sz="4" w:space="0" w:color="D9B2B2"/>
-              <w:right w:val="single" w:sz="4" w:space="0" w:color="D9B2B2"/>
+              <w:right w:val="none"/>
             </w:tcBorders>
           </w:tcPr>
           <w:p>
             <w:pPr>
-              <w:spacing w:before="0" w:after="0" w:line="288" w:lineRule="auto"/>
-              <w:jc w:val="left"/>
+              <w:spacing w:before="0" w:after="0" w:line="276" w:lineRule="auto"/>
             </w:pPr>
             <w:r>
               <w:rPr>
                 <w:rFonts w:ascii="Calibri" w:hAnsi="Calibri"/>
-                <w:color w:val="232832"/>
-                <w:sz w:val="19"/>
+                <w:color w:val="232323"/>
+                <w:sz w:val="20"/>
               </w:rPr>
               <w:t>Mariano Ponce</w:t>
             </w:r>
@@ -852,62 +879,60 @@
         <w:tc>
           <w:tcPr>
             <w:tcW w:type="dxa" w:w="4608"/>
-            <w:shd w:fill="FAF5F5"/>
+            <w:shd w:fill="FDF7F7"/>
             <w:tcMar>
-              <w:top w:w="80" w:type="dxa"/>
-              <w:bottom w:w="80" w:type="dxa"/>
+              <w:top w:w="100" w:type="dxa"/>
+              <w:bottom w:w="100" w:type="dxa"/>
               <w:left w:w="130" w:type="dxa"/>
               <w:right w:w="130" w:type="dxa"/>
             </w:tcMar>
             <w:tcBorders>
               <w:top w:val="single" w:sz="4" w:space="0" w:color="D9B2B2"/>
-              <w:left w:val="single" w:sz="4" w:space="0" w:color="D9B2B2"/>
+              <w:left w:val="none"/>
               <w:bottom w:val="single" w:sz="4" w:space="0" w:color="D9B2B2"/>
-              <w:right w:val="single" w:sz="4" w:space="0" w:color="D9B2B2"/>
+              <w:right w:val="none"/>
             </w:tcBorders>
           </w:tcPr>
           <w:p>
             <w:pPr>
-              <w:spacing w:before="0" w:after="0" w:line="288" w:lineRule="auto"/>
-              <w:jc w:val="left"/>
+              <w:spacing w:before="0" w:after="0" w:line="276" w:lineRule="auto"/>
             </w:pPr>
             <w:r>
               <w:rPr>
                 <w:rFonts w:ascii="Calibri" w:hAnsi="Calibri"/>
-                <w:color w:val="232832"/>
-                <w:sz w:val="19"/>
+                <w:color w:val="232323"/>
+                <w:sz w:val="20"/>
               </w:rPr>
-              <w:t>Managing editor, historian, bibliographer; organized publication archives</w:t>
+              <w:t>Managing editor, historian, bibliographer; organized publication archives and logistics</w:t>
             </w:r>
           </w:p>
         </w:tc>
         <w:tc>
           <w:tcPr>
             <w:tcW w:type="dxa" w:w="2160"/>
-            <w:shd w:fill="FAF5F5"/>
+            <w:shd w:fill="FDF7F7"/>
             <w:tcMar>
-              <w:top w:w="80" w:type="dxa"/>
-              <w:bottom w:w="80" w:type="dxa"/>
+              <w:top w:w="100" w:type="dxa"/>
+              <w:bottom w:w="100" w:type="dxa"/>
               <w:left w:w="130" w:type="dxa"/>
               <w:right w:w="130" w:type="dxa"/>
             </w:tcMar>
             <w:tcBorders>
               <w:top w:val="single" w:sz="4" w:space="0" w:color="D9B2B2"/>
-              <w:left w:val="single" w:sz="4" w:space="0" w:color="D9B2B2"/>
+              <w:left w:val="none"/>
               <w:bottom w:val="single" w:sz="4" w:space="0" w:color="D9B2B2"/>
-              <w:right w:val="single" w:sz="4" w:space="0" w:color="D9B2B2"/>
+              <w:right w:val="none"/>
             </w:tcBorders>
           </w:tcPr>
           <w:p>
             <w:pPr>
-              <w:spacing w:before="0" w:after="0" w:line="288" w:lineRule="auto"/>
-              <w:jc w:val="left"/>
+              <w:spacing w:before="0" w:after="0" w:line="276" w:lineRule="auto"/>
             </w:pPr>
             <w:r>
               <w:rPr>
                 <w:rFonts w:ascii="Calibri" w:hAnsi="Calibri"/>
-                <w:color w:val="232832"/>
-                <w:sz w:val="19"/>
+                <w:color w:val="232323"/>
+                <w:sz w:val="20"/>
               </w:rPr>
               <w:t>Naning, Tikbalang, Kalipulako</w:t>
             </w:r>
@@ -920,28 +945,27 @@
             <w:tcW w:type="dxa" w:w="2592"/>
             <w:shd w:fill="FFFFFF"/>
             <w:tcMar>
-              <w:top w:w="80" w:type="dxa"/>
-              <w:bottom w:w="80" w:type="dxa"/>
+              <w:top w:w="100" w:type="dxa"/>
+              <w:bottom w:w="100" w:type="dxa"/>
               <w:left w:w="130" w:type="dxa"/>
               <w:right w:w="130" w:type="dxa"/>
             </w:tcMar>
             <w:tcBorders>
               <w:top w:val="single" w:sz="4" w:space="0" w:color="D9B2B2"/>
-              <w:left w:val="single" w:sz="4" w:space="0" w:color="D9B2B2"/>
+              <w:left w:val="none"/>
               <w:bottom w:val="single" w:sz="4" w:space="0" w:color="D9B2B2"/>
-              <w:right w:val="single" w:sz="4" w:space="0" w:color="D9B2B2"/>
+              <w:right w:val="none"/>
             </w:tcBorders>
           </w:tcPr>
           <w:p>
             <w:pPr>
-              <w:spacing w:before="0" w:after="0" w:line="288" w:lineRule="auto"/>
-              <w:jc w:val="left"/>
+              <w:spacing w:before="0" w:after="0" w:line="276" w:lineRule="auto"/>
             </w:pPr>
             <w:r>
               <w:rPr>
                 <w:rFonts w:ascii="Calibri" w:hAnsi="Calibri"/>
-                <w:color w:val="232832"/>
-                <w:sz w:val="19"/>
+                <w:color w:val="232323"/>
+                <w:sz w:val="20"/>
               </w:rPr>
               <w:t>Antonio Luna</w:t>
             </w:r>
@@ -952,30 +976,29 @@
             <w:tcW w:type="dxa" w:w="4608"/>
             <w:shd w:fill="FFFFFF"/>
             <w:tcMar>
-              <w:top w:w="80" w:type="dxa"/>
-              <w:bottom w:w="80" w:type="dxa"/>
+              <w:top w:w="100" w:type="dxa"/>
+              <w:bottom w:w="100" w:type="dxa"/>
               <w:left w:w="130" w:type="dxa"/>
               <w:right w:w="130" w:type="dxa"/>
             </w:tcMar>
             <w:tcBorders>
               <w:top w:val="single" w:sz="4" w:space="0" w:color="D9B2B2"/>
-              <w:left w:val="single" w:sz="4" w:space="0" w:color="D9B2B2"/>
+              <w:left w:val="none"/>
               <w:bottom w:val="single" w:sz="4" w:space="0" w:color="D9B2B2"/>
-              <w:right w:val="single" w:sz="4" w:space="0" w:color="D9B2B2"/>
+              <w:right w:val="none"/>
             </w:tcBorders>
           </w:tcPr>
           <w:p>
             <w:pPr>
-              <w:spacing w:before="0" w:after="0" w:line="288" w:lineRule="auto"/>
-              <w:jc w:val="left"/>
+              <w:spacing w:before="0" w:after="0" w:line="276" w:lineRule="auto"/>
             </w:pPr>
             <w:r>
               <w:rPr>
                 <w:rFonts w:ascii="Calibri" w:hAnsi="Calibri"/>
-                <w:color w:val="232832"/>
-                <w:sz w:val="19"/>
+                <w:color w:val="232323"/>
+                <w:sz w:val="20"/>
               </w:rPr>
-              <w:t>Literary and scientific contributor; pharmacist; wrote about Spanish customs</w:t>
+              <w:t>Scientific contributor; pharmacist; military writer; exposed discrimination in Spanish society</w:t>
             </w:r>
           </w:p>
         </w:tc>
@@ -984,128 +1007,29 @@
             <w:tcW w:type="dxa" w:w="2160"/>
             <w:shd w:fill="FFFFFF"/>
             <w:tcMar>
-              <w:top w:w="80" w:type="dxa"/>
-              <w:bottom w:w="80" w:type="dxa"/>
+              <w:top w:w="100" w:type="dxa"/>
+              <w:bottom w:w="100" w:type="dxa"/>
               <w:left w:w="130" w:type="dxa"/>
               <w:right w:w="130" w:type="dxa"/>
             </w:tcMar>
             <w:tcBorders>
               <w:top w:val="single" w:sz="4" w:space="0" w:color="D9B2B2"/>
-              <w:left w:val="single" w:sz="4" w:space="0" w:color="D9B2B2"/>
+              <w:left w:val="none"/>
               <w:bottom w:val="single" w:sz="4" w:space="0" w:color="D9B2B2"/>
-              <w:right w:val="single" w:sz="4" w:space="0" w:color="D9B2B2"/>
+              <w:right w:val="none"/>
             </w:tcBorders>
           </w:tcPr>
           <w:p>
             <w:pPr>
-              <w:spacing w:before="0" w:after="0" w:line="288" w:lineRule="auto"/>
-              <w:jc w:val="left"/>
+              <w:spacing w:before="0" w:after="0" w:line="276" w:lineRule="auto"/>
             </w:pPr>
             <w:r>
               <w:rPr>
                 <w:rFonts w:ascii="Calibri" w:hAnsi="Calibri"/>
-                <w:color w:val="232832"/>
-                <w:sz w:val="19"/>
+                <w:color w:val="232323"/>
+                <w:sz w:val="20"/>
               </w:rPr>
               <w:t>Taga-Ilog</w:t>
-            </w:r>
-          </w:p>
-        </w:tc>
-      </w:tr>
-      <w:tr>
-        <w:tc>
-          <w:tcPr>
-            <w:tcW w:type="dxa" w:w="2592"/>
-            <w:shd w:fill="FAF5F5"/>
-            <w:tcMar>
-              <w:top w:w="80" w:type="dxa"/>
-              <w:bottom w:w="80" w:type="dxa"/>
-              <w:left w:w="130" w:type="dxa"/>
-              <w:right w:w="130" w:type="dxa"/>
-            </w:tcMar>
-            <w:tcBorders>
-              <w:top w:val="single" w:sz="4" w:space="0" w:color="D9B2B2"/>
-              <w:left w:val="single" w:sz="4" w:space="0" w:color="D9B2B2"/>
-              <w:bottom w:val="single" w:sz="4" w:space="0" w:color="D9B2B2"/>
-              <w:right w:val="single" w:sz="4" w:space="0" w:color="D9B2B2"/>
-            </w:tcBorders>
-          </w:tcPr>
-          <w:p>
-            <w:pPr>
-              <w:spacing w:before="0" w:after="0" w:line="288" w:lineRule="auto"/>
-              <w:jc w:val="left"/>
-            </w:pPr>
-            <w:r>
-              <w:rPr>
-                <w:rFonts w:ascii="Calibri" w:hAnsi="Calibri"/>
-                <w:color w:val="232832"/>
-                <w:sz w:val="19"/>
-              </w:rPr>
-              <w:t>Jose Maria Panganiban</w:t>
-            </w:r>
-          </w:p>
-        </w:tc>
-        <w:tc>
-          <w:tcPr>
-            <w:tcW w:type="dxa" w:w="4608"/>
-            <w:shd w:fill="FAF5F5"/>
-            <w:tcMar>
-              <w:top w:w="80" w:type="dxa"/>
-              <w:bottom w:w="80" w:type="dxa"/>
-              <w:left w:w="130" w:type="dxa"/>
-              <w:right w:w="130" w:type="dxa"/>
-            </w:tcMar>
-            <w:tcBorders>
-              <w:top w:val="single" w:sz="4" w:space="0" w:color="D9B2B2"/>
-              <w:left w:val="single" w:sz="4" w:space="0" w:color="D9B2B2"/>
-              <w:bottom w:val="single" w:sz="4" w:space="0" w:color="D9B2B2"/>
-              <w:right w:val="single" w:sz="4" w:space="0" w:color="D9B2B2"/>
-            </w:tcBorders>
-          </w:tcPr>
-          <w:p>
-            <w:pPr>
-              <w:spacing w:before="0" w:after="0" w:line="288" w:lineRule="auto"/>
-              <w:jc w:val="left"/>
-            </w:pPr>
-            <w:r>
-              <w:rPr>
-                <w:rFonts w:ascii="Calibri" w:hAnsi="Calibri"/>
-                <w:color w:val="232832"/>
-                <w:sz w:val="19"/>
-              </w:rPr>
-              <w:t>Brilliant essayist and orator; wrote articles demanding freedom of the press</w:t>
-            </w:r>
-          </w:p>
-        </w:tc>
-        <w:tc>
-          <w:tcPr>
-            <w:tcW w:type="dxa" w:w="2160"/>
-            <w:shd w:fill="FAF5F5"/>
-            <w:tcMar>
-              <w:top w:w="80" w:type="dxa"/>
-              <w:bottom w:w="80" w:type="dxa"/>
-              <w:left w:w="130" w:type="dxa"/>
-              <w:right w:w="130" w:type="dxa"/>
-            </w:tcMar>
-            <w:tcBorders>
-              <w:top w:val="single" w:sz="4" w:space="0" w:color="D9B2B2"/>
-              <w:left w:val="single" w:sz="4" w:space="0" w:color="D9B2B2"/>
-              <w:bottom w:val="single" w:sz="4" w:space="0" w:color="D9B2B2"/>
-              <w:right w:val="single" w:sz="4" w:space="0" w:color="D9B2B2"/>
-            </w:tcBorders>
-          </w:tcPr>
-          <w:p>
-            <w:pPr>
-              <w:spacing w:before="0" w:after="0" w:line="288" w:lineRule="auto"/>
-              <w:jc w:val="left"/>
-            </w:pPr>
-            <w:r>
-              <w:rPr>
-                <w:rFonts w:ascii="Calibri" w:hAnsi="Calibri"/>
-                <w:color w:val="232832"/>
-                <w:sz w:val="19"/>
-              </w:rPr>
-              <w:t>Jomapa</w:t>
             </w:r>
           </w:p>
         </w:tc>
@@ -1156,7 +1080,7 @@
                 <w:color w:val="FFFFFF"/>
                 <w:sz w:val="25"/>
               </w:rPr>
-              <w:t>TOPIC 2: LA LIGA FILIPINA, ARREST &amp; DISSOLUTION</w:t>
+              <w:t>TOPIC 2: RIZAL AND LA LIGA FILIPINA (03 HANDOUT 2A)</w:t>
             </w:r>
           </w:p>
         </w:tc>
@@ -1169,20 +1093,20 @@
     </w:p>
     <w:p>
       <w:pPr>
-        <w:spacing w:before="0" w:after="80" w:line="312" w:lineRule="auto"/>
+        <w:spacing w:before="0" w:after="80" w:line="300" w:lineRule="auto"/>
       </w:pPr>
       <w:r>
         <w:rPr>
           <w:rFonts w:ascii="Calibri" w:hAnsi="Calibri"/>
-          <w:color w:val="232832"/>
+          <w:color w:val="323232"/>
           <w:sz w:val="22"/>
         </w:rPr>
-        <w:t>Rizal realized that campaigning abroad in Europe was ineffective. Real reform had to happen on Philippine soil, directly mobilizing the Filipino people.</w:t>
+        <w:t>Rizal realized that campaigning abroad in Europe was insufficient. Real reform had to happen on Philippine soil, directly mobilizing and organizing the Filipino people.</w:t>
       </w:r>
     </w:p>
     <w:p>
       <w:pPr>
-        <w:spacing w:before="0" w:after="80" w:line="312" w:lineRule="auto"/>
+        <w:spacing w:before="0" w:after="80" w:line="300" w:lineRule="auto"/>
         <w:ind w:left="360"/>
       </w:pPr>
       <w:r>
@@ -1190,15 +1114,15 @@
           <w:rFonts w:ascii="Calibri" w:hAnsi="Calibri"/>
           <w:b/>
           <w:color w:val="7A1C1C"/>
-          <w:sz w:val="22"/>
+          <w:sz w:val="20"/>
         </w:rPr>
-        <w:t xml:space="preserve">•  </w:t>
+        <w:t xml:space="preserve">▪  </w:t>
       </w:r>
       <w:r>
         <w:rPr>
           <w:rFonts w:ascii="Calibri" w:hAnsi="Calibri"/>
           <w:b/>
-          <w:color w:val="191E28"/>
+          <w:color w:val="1E1E1E"/>
           <w:sz w:val="22"/>
         </w:rPr>
         <w:t xml:space="preserve">Return to Manila: </w:t>
@@ -1206,7 +1130,7 @@
       <w:r>
         <w:rPr>
           <w:rFonts w:ascii="Calibri" w:hAnsi="Calibri"/>
-          <w:color w:val="232832"/>
+          <w:color w:val="323232"/>
           <w:sz w:val="22"/>
         </w:rPr>
         <w:t>June 26, 1892</w:t>
@@ -1214,7 +1138,7 @@
     </w:p>
     <w:p>
       <w:pPr>
-        <w:spacing w:before="0" w:after="80" w:line="312" w:lineRule="auto"/>
+        <w:spacing w:before="0" w:after="80" w:line="300" w:lineRule="auto"/>
         <w:ind w:left="360"/>
       </w:pPr>
       <w:r>
@@ -1222,14 +1146,14 @@
           <w:rFonts w:ascii="Calibri" w:hAnsi="Calibri"/>
           <w:b/>
           <w:color w:val="7A1C1C"/>
-          <w:sz w:val="22"/>
+          <w:sz w:val="20"/>
         </w:rPr>
-        <w:t xml:space="preserve">•  </w:t>
+        <w:t xml:space="preserve">▪  </w:t>
       </w:r>
       <w:r>
         <w:rPr>
           <w:rFonts w:ascii="Calibri" w:hAnsi="Calibri"/>
-          <w:color w:val="232832"/>
+          <w:color w:val="323232"/>
           <w:sz w:val="22"/>
         </w:rPr>
         <w:t>Rizal arrived in Manila from Hong Kong and was immediately placed under close surveillance by Spanish authorities.</w:t>
@@ -1237,7 +1161,7 @@
     </w:p>
     <w:p>
       <w:pPr>
-        <w:spacing w:before="0" w:after="80" w:line="312" w:lineRule="auto"/>
+        <w:spacing w:before="0" w:after="80" w:line="300" w:lineRule="auto"/>
         <w:ind w:left="360"/>
       </w:pPr>
       <w:r>
@@ -1245,15 +1169,15 @@
           <w:rFonts w:ascii="Calibri" w:hAnsi="Calibri"/>
           <w:b/>
           <w:color w:val="7A1C1C"/>
-          <w:sz w:val="22"/>
+          <w:sz w:val="20"/>
         </w:rPr>
-        <w:t xml:space="preserve">•  </w:t>
+        <w:t xml:space="preserve">▪  </w:t>
       </w:r>
       <w:r>
         <w:rPr>
           <w:rFonts w:ascii="Calibri" w:hAnsi="Calibri"/>
           <w:b/>
-          <w:color w:val="191E28"/>
+          <w:color w:val="1E1E1E"/>
           <w:sz w:val="22"/>
         </w:rPr>
         <w:t xml:space="preserve">Founding of La Liga: </w:t>
@@ -1261,7 +1185,7 @@
       <w:r>
         <w:rPr>
           <w:rFonts w:ascii="Calibri" w:hAnsi="Calibri"/>
-          <w:color w:val="232832"/>
+          <w:color w:val="323232"/>
           <w:sz w:val="22"/>
         </w:rPr>
         <w:t>July 3, 1892</w:t>
@@ -1269,7 +1193,7 @@
     </w:p>
     <w:p>
       <w:pPr>
-        <w:spacing w:before="0" w:after="80" w:line="312" w:lineRule="auto"/>
+        <w:spacing w:before="0" w:after="80" w:line="300" w:lineRule="auto"/>
         <w:ind w:left="360"/>
       </w:pPr>
       <w:r>
@@ -1277,14 +1201,14 @@
           <w:rFonts w:ascii="Calibri" w:hAnsi="Calibri"/>
           <w:b/>
           <w:color w:val="7A1C1C"/>
-          <w:sz w:val="22"/>
+          <w:sz w:val="20"/>
         </w:rPr>
-        <w:t xml:space="preserve">•  </w:t>
+        <w:t xml:space="preserve">▪  </w:t>
       </w:r>
       <w:r>
         <w:rPr>
           <w:rFonts w:ascii="Calibri" w:hAnsi="Calibri"/>
-          <w:color w:val="232832"/>
+          <w:color w:val="323232"/>
           <w:sz w:val="22"/>
         </w:rPr>
         <w:t>Inaugural meeting held at the residence of Doroteo Ongjungco on Ilaya Street, Tondo, Manila.</w:t>
@@ -1292,7 +1216,7 @@
     </w:p>
     <w:p>
       <w:pPr>
-        <w:spacing w:before="0" w:after="80" w:line="312" w:lineRule="auto"/>
+        <w:spacing w:before="0" w:after="80" w:line="300" w:lineRule="auto"/>
         <w:ind w:left="360"/>
       </w:pPr>
       <w:r>
@@ -1300,15 +1224,15 @@
           <w:rFonts w:ascii="Calibri" w:hAnsi="Calibri"/>
           <w:b/>
           <w:color w:val="7A1C1C"/>
-          <w:sz w:val="22"/>
+          <w:sz w:val="20"/>
         </w:rPr>
-        <w:t xml:space="preserve">•  </w:t>
+        <w:t xml:space="preserve">▪  </w:t>
       </w:r>
       <w:r>
         <w:rPr>
           <w:rFonts w:ascii="Calibri" w:hAnsi="Calibri"/>
           <w:b/>
-          <w:color w:val="191E28"/>
+          <w:color w:val="1E1E1E"/>
           <w:sz w:val="22"/>
         </w:rPr>
         <w:t xml:space="preserve">Rizal's Arrest: </w:t>
@@ -1316,7 +1240,7 @@
       <w:r>
         <w:rPr>
           <w:rFonts w:ascii="Calibri" w:hAnsi="Calibri"/>
-          <w:color w:val="232832"/>
+          <w:color w:val="323232"/>
           <w:sz w:val="22"/>
         </w:rPr>
         <w:t>July 6, 1892</w:t>
@@ -1324,7 +1248,7 @@
     </w:p>
     <w:p>
       <w:pPr>
-        <w:spacing w:before="0" w:after="80" w:line="312" w:lineRule="auto"/>
+        <w:spacing w:before="0" w:after="80" w:line="300" w:lineRule="auto"/>
         <w:ind w:left="360"/>
       </w:pPr>
       <w:r>
@@ -1332,14 +1256,14 @@
           <w:rFonts w:ascii="Calibri" w:hAnsi="Calibri"/>
           <w:b/>
           <w:color w:val="7A1C1C"/>
-          <w:sz w:val="22"/>
+          <w:sz w:val="20"/>
         </w:rPr>
-        <w:t xml:space="preserve">•  </w:t>
+        <w:t xml:space="preserve">▪  </w:t>
       </w:r>
       <w:r>
         <w:rPr>
           <w:rFonts w:ascii="Calibri" w:hAnsi="Calibri"/>
-          <w:color w:val="232832"/>
+          <w:color w:val="323232"/>
           <w:sz w:val="22"/>
         </w:rPr>
         <w:t>Barely three days after founding La Liga, Rizal was arrested by order of Governor-General Eulogio Despujol.</w:t>
@@ -1347,7 +1271,7 @@
     </w:p>
     <w:p>
       <w:pPr>
-        <w:spacing w:before="0" w:after="80" w:line="312" w:lineRule="auto"/>
+        <w:spacing w:before="0" w:after="80" w:line="300" w:lineRule="auto"/>
         <w:ind w:left="360"/>
       </w:pPr>
       <w:r>
@@ -1355,15 +1279,15 @@
           <w:rFonts w:ascii="Calibri" w:hAnsi="Calibri"/>
           <w:b/>
           <w:color w:val="7A1C1C"/>
-          <w:sz w:val="22"/>
+          <w:sz w:val="20"/>
         </w:rPr>
-        <w:t xml:space="preserve">•  </w:t>
+        <w:t xml:space="preserve">▪  </w:t>
       </w:r>
       <w:r>
         <w:rPr>
           <w:rFonts w:ascii="Calibri" w:hAnsi="Calibri"/>
           <w:b/>
-          <w:color w:val="191E28"/>
+          <w:color w:val="1E1E1E"/>
           <w:sz w:val="22"/>
         </w:rPr>
         <w:t xml:space="preserve">Formal Charge: </w:t>
@@ -1371,10 +1295,10 @@
       <w:r>
         <w:rPr>
           <w:rFonts w:ascii="Calibri" w:hAnsi="Calibri"/>
-          <w:color w:val="232832"/>
+          <w:color w:val="323232"/>
           <w:sz w:val="22"/>
         </w:rPr>
-        <w:t>Possession of anti-friar leaflets titled 'Pobres Frailes' allegedly found in his sister Lucia's baggage.</w:t>
+        <w:t>Possession of anti-friar handbills titled 'Pobres Frailes' allegedly found in sister Lucia's baggage.</w:t>
       </w:r>
     </w:p>
     <w:tbl>
@@ -1422,10 +1346,10 @@
             <w:r>
               <w:rPr>
                 <w:rFonts w:ascii="Calibri" w:hAnsi="Calibri"/>
-                <w:color w:val="232832"/>
+                <w:color w:val="282828"/>
                 <w:sz w:val="21"/>
               </w:rPr>
-              <w:t>A socio-civic grassroots organization founded by Jose Rizal in Tondo on July 3, 1892, aimed at uniting the whole archipelago, mutual protection among members, economic cooperation, and non-violent pursuit of legal reforms.</w:t>
+              <w:t>A socio-civic grassroots organization founded by Jose Rizal in Tondo on July 3, 1892, aimed at uniting the whole archipelago, mutual protection against violence, encouragement of education and agriculture, and lawful reforms.</w:t>
             </w:r>
           </w:p>
         </w:tc>
@@ -1454,29 +1378,22 @@
             <w:tcW w:type="dxa" w:w="2592"/>
             <w:shd w:fill="7A1C1C"/>
             <w:tcMar>
-              <w:top w:w="100" w:type="dxa"/>
-              <w:bottom w:w="100" w:type="dxa"/>
-              <w:left w:w="130" w:type="dxa"/>
-              <w:right w:w="130" w:type="dxa"/>
+              <w:top w:w="120" w:type="dxa"/>
+              <w:bottom w:w="120" w:type="dxa"/>
+              <w:left w:w="140" w:type="dxa"/>
+              <w:right w:w="140" w:type="dxa"/>
             </w:tcMar>
-            <w:tcBorders>
-              <w:top w:val="single" w:sz="4" w:space="0" w:color="D9B2B2"/>
-              <w:left w:val="single" w:sz="4" w:space="0" w:color="D9B2B2"/>
-              <w:bottom w:val="single" w:sz="4" w:space="0" w:color="D9B2B2"/>
-              <w:right w:val="single" w:sz="4" w:space="0" w:color="D9B2B2"/>
-            </w:tcBorders>
           </w:tcPr>
           <w:p>
             <w:pPr>
-              <w:spacing w:before="0" w:after="0"/>
-              <w:jc w:val="left"/>
+              <w:spacing w:before="0" w:after="0" w:line="276" w:lineRule="auto"/>
             </w:pPr>
             <w:r>
               <w:rPr>
                 <w:rFonts w:ascii="Calibri" w:hAnsi="Calibri"/>
                 <w:b/>
                 <w:color w:val="FFFFFF"/>
-                <w:sz w:val="20"/>
+                <w:sz w:val="21"/>
               </w:rPr>
               <w:t>Historical Personality</w:t>
             </w:r>
@@ -1487,29 +1404,22 @@
             <w:tcW w:type="dxa" w:w="3312"/>
             <w:shd w:fill="7A1C1C"/>
             <w:tcMar>
-              <w:top w:w="100" w:type="dxa"/>
-              <w:bottom w:w="100" w:type="dxa"/>
-              <w:left w:w="130" w:type="dxa"/>
-              <w:right w:w="130" w:type="dxa"/>
+              <w:top w:w="120" w:type="dxa"/>
+              <w:bottom w:w="120" w:type="dxa"/>
+              <w:left w:w="140" w:type="dxa"/>
+              <w:right w:w="140" w:type="dxa"/>
             </w:tcMar>
-            <w:tcBorders>
-              <w:top w:val="single" w:sz="4" w:space="0" w:color="D9B2B2"/>
-              <w:left w:val="single" w:sz="4" w:space="0" w:color="D9B2B2"/>
-              <w:bottom w:val="single" w:sz="4" w:space="0" w:color="D9B2B2"/>
-              <w:right w:val="single" w:sz="4" w:space="0" w:color="D9B2B2"/>
-            </w:tcBorders>
           </w:tcPr>
           <w:p>
             <w:pPr>
-              <w:spacing w:before="0" w:after="0"/>
-              <w:jc w:val="left"/>
+              <w:spacing w:before="0" w:after="0" w:line="276" w:lineRule="auto"/>
             </w:pPr>
             <w:r>
               <w:rPr>
                 <w:rFonts w:ascii="Calibri" w:hAnsi="Calibri"/>
                 <w:b/>
                 <w:color w:val="FFFFFF"/>
-                <w:sz w:val="20"/>
+                <w:sz w:val="21"/>
               </w:rPr>
               <w:t>Role in La Liga Filipina</w:t>
             </w:r>
@@ -1520,29 +1430,22 @@
             <w:tcW w:type="dxa" w:w="3456"/>
             <w:shd w:fill="7A1C1C"/>
             <w:tcMar>
-              <w:top w:w="100" w:type="dxa"/>
-              <w:bottom w:w="100" w:type="dxa"/>
-              <w:left w:w="130" w:type="dxa"/>
-              <w:right w:w="130" w:type="dxa"/>
+              <w:top w:w="120" w:type="dxa"/>
+              <w:bottom w:w="120" w:type="dxa"/>
+              <w:left w:w="140" w:type="dxa"/>
+              <w:right w:w="140" w:type="dxa"/>
             </w:tcMar>
-            <w:tcBorders>
-              <w:top w:val="single" w:sz="4" w:space="0" w:color="D9B2B2"/>
-              <w:left w:val="single" w:sz="4" w:space="0" w:color="D9B2B2"/>
-              <w:bottom w:val="single" w:sz="4" w:space="0" w:color="D9B2B2"/>
-              <w:right w:val="single" w:sz="4" w:space="0" w:color="D9B2B2"/>
-            </w:tcBorders>
           </w:tcPr>
           <w:p>
             <w:pPr>
-              <w:spacing w:before="0" w:after="0"/>
-              <w:jc w:val="left"/>
+              <w:spacing w:before="0" w:after="0" w:line="276" w:lineRule="auto"/>
             </w:pPr>
             <w:r>
               <w:rPr>
                 <w:rFonts w:ascii="Calibri" w:hAnsi="Calibri"/>
                 <w:b/>
                 <w:color w:val="FFFFFF"/>
-                <w:sz w:val="20"/>
+                <w:sz w:val="21"/>
               </w:rPr>
               <w:t>Subsequent Role / Impact</w:t>
             </w:r>
@@ -1555,28 +1458,27 @@
             <w:tcW w:type="dxa" w:w="2592"/>
             <w:shd w:fill="FFFFFF"/>
             <w:tcMar>
-              <w:top w:w="80" w:type="dxa"/>
-              <w:bottom w:w="80" w:type="dxa"/>
+              <w:top w:w="100" w:type="dxa"/>
+              <w:bottom w:w="100" w:type="dxa"/>
               <w:left w:w="130" w:type="dxa"/>
               <w:right w:w="130" w:type="dxa"/>
             </w:tcMar>
             <w:tcBorders>
               <w:top w:val="single" w:sz="4" w:space="0" w:color="D9B2B2"/>
-              <w:left w:val="single" w:sz="4" w:space="0" w:color="D9B2B2"/>
+              <w:left w:val="none"/>
               <w:bottom w:val="single" w:sz="4" w:space="0" w:color="D9B2B2"/>
-              <w:right w:val="single" w:sz="4" w:space="0" w:color="D9B2B2"/>
+              <w:right w:val="none"/>
             </w:tcBorders>
           </w:tcPr>
           <w:p>
             <w:pPr>
-              <w:spacing w:before="0" w:after="0" w:line="288" w:lineRule="auto"/>
-              <w:jc w:val="left"/>
+              <w:spacing w:before="0" w:after="0" w:line="276" w:lineRule="auto"/>
             </w:pPr>
             <w:r>
               <w:rPr>
                 <w:rFonts w:ascii="Calibri" w:hAnsi="Calibri"/>
-                <w:color w:val="232832"/>
-                <w:sz w:val="19"/>
+                <w:color w:val="232323"/>
+                <w:sz w:val="20"/>
               </w:rPr>
               <w:t>Ambrosio Salvador</w:t>
             </w:r>
@@ -1587,28 +1489,27 @@
             <w:tcW w:type="dxa" w:w="3312"/>
             <w:shd w:fill="FFFFFF"/>
             <w:tcMar>
-              <w:top w:w="80" w:type="dxa"/>
-              <w:bottom w:w="80" w:type="dxa"/>
+              <w:top w:w="100" w:type="dxa"/>
+              <w:bottom w:w="100" w:type="dxa"/>
               <w:left w:w="130" w:type="dxa"/>
               <w:right w:w="130" w:type="dxa"/>
             </w:tcMar>
             <w:tcBorders>
               <w:top w:val="single" w:sz="4" w:space="0" w:color="D9B2B2"/>
-              <w:left w:val="single" w:sz="4" w:space="0" w:color="D9B2B2"/>
+              <w:left w:val="none"/>
               <w:bottom w:val="single" w:sz="4" w:space="0" w:color="D9B2B2"/>
-              <w:right w:val="single" w:sz="4" w:space="0" w:color="D9B2B2"/>
+              <w:right w:val="none"/>
             </w:tcBorders>
           </w:tcPr>
           <w:p>
             <w:pPr>
-              <w:spacing w:before="0" w:after="0" w:line="288" w:lineRule="auto"/>
-              <w:jc w:val="left"/>
+              <w:spacing w:before="0" w:after="0" w:line="276" w:lineRule="auto"/>
             </w:pPr>
             <w:r>
               <w:rPr>
                 <w:rFonts w:ascii="Calibri" w:hAnsi="Calibri"/>
-                <w:color w:val="232832"/>
-                <w:sz w:val="19"/>
+                <w:color w:val="232323"/>
+                <w:sz w:val="20"/>
               </w:rPr>
               <w:t>Elected as First President</w:t>
             </w:r>
@@ -1619,28 +1520,27 @@
             <w:tcW w:type="dxa" w:w="3456"/>
             <w:shd w:fill="FFFFFF"/>
             <w:tcMar>
-              <w:top w:w="80" w:type="dxa"/>
-              <w:bottom w:w="80" w:type="dxa"/>
+              <w:top w:w="100" w:type="dxa"/>
+              <w:bottom w:w="100" w:type="dxa"/>
               <w:left w:w="130" w:type="dxa"/>
               <w:right w:w="130" w:type="dxa"/>
             </w:tcMar>
             <w:tcBorders>
               <w:top w:val="single" w:sz="4" w:space="0" w:color="D9B2B2"/>
-              <w:left w:val="single" w:sz="4" w:space="0" w:color="D9B2B2"/>
+              <w:left w:val="none"/>
               <w:bottom w:val="single" w:sz="4" w:space="0" w:color="D9B2B2"/>
-              <w:right w:val="single" w:sz="4" w:space="0" w:color="D9B2B2"/>
+              <w:right w:val="none"/>
             </w:tcBorders>
           </w:tcPr>
           <w:p>
             <w:pPr>
-              <w:spacing w:before="0" w:after="0" w:line="288" w:lineRule="auto"/>
-              <w:jc w:val="left"/>
+              <w:spacing w:before="0" w:after="0" w:line="276" w:lineRule="auto"/>
             </w:pPr>
             <w:r>
               <w:rPr>
                 <w:rFonts w:ascii="Calibri" w:hAnsi="Calibri"/>
-                <w:color w:val="232832"/>
-                <w:sz w:val="19"/>
+                <w:color w:val="232323"/>
+                <w:sz w:val="20"/>
               </w:rPr>
               <w:t>Guided the initial civic foundation of the league</w:t>
             </w:r>
@@ -1651,30 +1551,29 @@
         <w:tc>
           <w:tcPr>
             <w:tcW w:type="dxa" w:w="2592"/>
-            <w:shd w:fill="FAF5F5"/>
+            <w:shd w:fill="FDF7F7"/>
             <w:tcMar>
-              <w:top w:w="80" w:type="dxa"/>
-              <w:bottom w:w="80" w:type="dxa"/>
+              <w:top w:w="100" w:type="dxa"/>
+              <w:bottom w:w="100" w:type="dxa"/>
               <w:left w:w="130" w:type="dxa"/>
               <w:right w:w="130" w:type="dxa"/>
             </w:tcMar>
             <w:tcBorders>
               <w:top w:val="single" w:sz="4" w:space="0" w:color="D9B2B2"/>
-              <w:left w:val="single" w:sz="4" w:space="0" w:color="D9B2B2"/>
+              <w:left w:val="none"/>
               <w:bottom w:val="single" w:sz="4" w:space="0" w:color="D9B2B2"/>
-              <w:right w:val="single" w:sz="4" w:space="0" w:color="D9B2B2"/>
+              <w:right w:val="none"/>
             </w:tcBorders>
           </w:tcPr>
           <w:p>
             <w:pPr>
-              <w:spacing w:before="0" w:after="0" w:line="288" w:lineRule="auto"/>
-              <w:jc w:val="left"/>
+              <w:spacing w:before="0" w:after="0" w:line="276" w:lineRule="auto"/>
             </w:pPr>
             <w:r>
               <w:rPr>
                 <w:rFonts w:ascii="Calibri" w:hAnsi="Calibri"/>
-                <w:color w:val="232832"/>
-                <w:sz w:val="19"/>
+                <w:color w:val="232323"/>
+                <w:sz w:val="20"/>
               </w:rPr>
               <w:t>Deodato Arellano</w:t>
             </w:r>
@@ -1683,30 +1582,29 @@
         <w:tc>
           <w:tcPr>
             <w:tcW w:type="dxa" w:w="3312"/>
-            <w:shd w:fill="FAF5F5"/>
+            <w:shd w:fill="FDF7F7"/>
             <w:tcMar>
-              <w:top w:w="80" w:type="dxa"/>
-              <w:bottom w:w="80" w:type="dxa"/>
+              <w:top w:w="100" w:type="dxa"/>
+              <w:bottom w:w="100" w:type="dxa"/>
               <w:left w:w="130" w:type="dxa"/>
               <w:right w:w="130" w:type="dxa"/>
             </w:tcMar>
             <w:tcBorders>
               <w:top w:val="single" w:sz="4" w:space="0" w:color="D9B2B2"/>
-              <w:left w:val="single" w:sz="4" w:space="0" w:color="D9B2B2"/>
+              <w:left w:val="none"/>
               <w:bottom w:val="single" w:sz="4" w:space="0" w:color="D9B2B2"/>
-              <w:right w:val="single" w:sz="4" w:space="0" w:color="D9B2B2"/>
+              <w:right w:val="none"/>
             </w:tcBorders>
           </w:tcPr>
           <w:p>
             <w:pPr>
-              <w:spacing w:before="0" w:after="0" w:line="288" w:lineRule="auto"/>
-              <w:jc w:val="left"/>
+              <w:spacing w:before="0" w:after="0" w:line="276" w:lineRule="auto"/>
             </w:pPr>
             <w:r>
               <w:rPr>
                 <w:rFonts w:ascii="Calibri" w:hAnsi="Calibri"/>
-                <w:color w:val="232832"/>
-                <w:sz w:val="19"/>
+                <w:color w:val="232323"/>
+                <w:sz w:val="20"/>
               </w:rPr>
               <w:t>Elected as Secretary</w:t>
             </w:r>
@@ -1715,30 +1613,29 @@
         <w:tc>
           <w:tcPr>
             <w:tcW w:type="dxa" w:w="3456"/>
-            <w:shd w:fill="FAF5F5"/>
+            <w:shd w:fill="FDF7F7"/>
             <w:tcMar>
-              <w:top w:w="80" w:type="dxa"/>
-              <w:bottom w:w="80" w:type="dxa"/>
+              <w:top w:w="100" w:type="dxa"/>
+              <w:bottom w:w="100" w:type="dxa"/>
               <w:left w:w="130" w:type="dxa"/>
               <w:right w:w="130" w:type="dxa"/>
             </w:tcMar>
             <w:tcBorders>
               <w:top w:val="single" w:sz="4" w:space="0" w:color="D9B2B2"/>
-              <w:left w:val="single" w:sz="4" w:space="0" w:color="D9B2B2"/>
+              <w:left w:val="none"/>
               <w:bottom w:val="single" w:sz="4" w:space="0" w:color="D9B2B2"/>
-              <w:right w:val="single" w:sz="4" w:space="0" w:color="D9B2B2"/>
+              <w:right w:val="none"/>
             </w:tcBorders>
           </w:tcPr>
           <w:p>
             <w:pPr>
-              <w:spacing w:before="0" w:after="0" w:line="288" w:lineRule="auto"/>
-              <w:jc w:val="left"/>
+              <w:spacing w:before="0" w:after="0" w:line="276" w:lineRule="auto"/>
             </w:pPr>
             <w:r>
               <w:rPr>
                 <w:rFonts w:ascii="Calibri" w:hAnsi="Calibri"/>
-                <w:color w:val="232832"/>
-                <w:sz w:val="19"/>
+                <w:color w:val="232323"/>
+                <w:sz w:val="20"/>
               </w:rPr>
               <w:t>Co-founded the Katipunan; became its 1st Supreme President</w:t>
             </w:r>
@@ -1751,28 +1648,27 @@
             <w:tcW w:type="dxa" w:w="2592"/>
             <w:shd w:fill="FFFFFF"/>
             <w:tcMar>
-              <w:top w:w="80" w:type="dxa"/>
-              <w:bottom w:w="80" w:type="dxa"/>
+              <w:top w:w="100" w:type="dxa"/>
+              <w:bottom w:w="100" w:type="dxa"/>
               <w:left w:w="130" w:type="dxa"/>
               <w:right w:w="130" w:type="dxa"/>
             </w:tcMar>
             <w:tcBorders>
               <w:top w:val="single" w:sz="4" w:space="0" w:color="D9B2B2"/>
-              <w:left w:val="single" w:sz="4" w:space="0" w:color="D9B2B2"/>
+              <w:left w:val="none"/>
               <w:bottom w:val="single" w:sz="4" w:space="0" w:color="D9B2B2"/>
-              <w:right w:val="single" w:sz="4" w:space="0" w:color="D9B2B2"/>
+              <w:right w:val="none"/>
             </w:tcBorders>
           </w:tcPr>
           <w:p>
             <w:pPr>
-              <w:spacing w:before="0" w:after="0" w:line="288" w:lineRule="auto"/>
-              <w:jc w:val="left"/>
+              <w:spacing w:before="0" w:after="0" w:line="276" w:lineRule="auto"/>
             </w:pPr>
             <w:r>
               <w:rPr>
                 <w:rFonts w:ascii="Calibri" w:hAnsi="Calibri"/>
-                <w:color w:val="232832"/>
-                <w:sz w:val="19"/>
+                <w:color w:val="232323"/>
+                <w:sz w:val="20"/>
               </w:rPr>
               <w:t>Andres Bonifacio</w:t>
             </w:r>
@@ -1783,28 +1679,27 @@
             <w:tcW w:type="dxa" w:w="3312"/>
             <w:shd w:fill="FFFFFF"/>
             <w:tcMar>
-              <w:top w:w="80" w:type="dxa"/>
-              <w:bottom w:w="80" w:type="dxa"/>
+              <w:top w:w="100" w:type="dxa"/>
+              <w:bottom w:w="100" w:type="dxa"/>
               <w:left w:w="130" w:type="dxa"/>
               <w:right w:w="130" w:type="dxa"/>
             </w:tcMar>
             <w:tcBorders>
               <w:top w:val="single" w:sz="4" w:space="0" w:color="D9B2B2"/>
-              <w:left w:val="single" w:sz="4" w:space="0" w:color="D9B2B2"/>
+              <w:left w:val="none"/>
               <w:bottom w:val="single" w:sz="4" w:space="0" w:color="D9B2B2"/>
-              <w:right w:val="single" w:sz="4" w:space="0" w:color="D9B2B2"/>
+              <w:right w:val="none"/>
             </w:tcBorders>
           </w:tcPr>
           <w:p>
             <w:pPr>
-              <w:spacing w:before="0" w:after="0" w:line="288" w:lineRule="auto"/>
-              <w:jc w:val="left"/>
+              <w:spacing w:before="0" w:after="0" w:line="276" w:lineRule="auto"/>
             </w:pPr>
             <w:r>
               <w:rPr>
                 <w:rFonts w:ascii="Calibri" w:hAnsi="Calibri"/>
-                <w:color w:val="232832"/>
-                <w:sz w:val="19"/>
+                <w:color w:val="232323"/>
+                <w:sz w:val="20"/>
               </w:rPr>
               <w:t>Attended as Fiscal / Active Member</w:t>
             </w:r>
@@ -1815,28 +1710,27 @@
             <w:tcW w:type="dxa" w:w="3456"/>
             <w:shd w:fill="FFFFFF"/>
             <w:tcMar>
-              <w:top w:w="80" w:type="dxa"/>
-              <w:bottom w:w="80" w:type="dxa"/>
+              <w:top w:w="100" w:type="dxa"/>
+              <w:bottom w:w="100" w:type="dxa"/>
               <w:left w:w="130" w:type="dxa"/>
               <w:right w:w="130" w:type="dxa"/>
             </w:tcMar>
             <w:tcBorders>
               <w:top w:val="single" w:sz="4" w:space="0" w:color="D9B2B2"/>
-              <w:left w:val="single" w:sz="4" w:space="0" w:color="D9B2B2"/>
+              <w:left w:val="none"/>
               <w:bottom w:val="single" w:sz="4" w:space="0" w:color="D9B2B2"/>
-              <w:right w:val="single" w:sz="4" w:space="0" w:color="D9B2B2"/>
+              <w:right w:val="none"/>
             </w:tcBorders>
           </w:tcPr>
           <w:p>
             <w:pPr>
-              <w:spacing w:before="0" w:after="0" w:line="288" w:lineRule="auto"/>
-              <w:jc w:val="left"/>
+              <w:spacing w:before="0" w:after="0" w:line="276" w:lineRule="auto"/>
             </w:pPr>
             <w:r>
               <w:rPr>
                 <w:rFonts w:ascii="Calibri" w:hAnsi="Calibri"/>
-                <w:color w:val="232832"/>
-                <w:sz w:val="19"/>
+                <w:color w:val="232323"/>
+                <w:sz w:val="20"/>
               </w:rPr>
               <w:t>Founded the Katipunan on July 7, 1892 following Rizal's arrest</w:t>
             </w:r>
@@ -1847,30 +1741,29 @@
         <w:tc>
           <w:tcPr>
             <w:tcW w:type="dxa" w:w="2592"/>
-            <w:shd w:fill="FAF5F5"/>
+            <w:shd w:fill="FDF7F7"/>
             <w:tcMar>
-              <w:top w:w="80" w:type="dxa"/>
-              <w:bottom w:w="80" w:type="dxa"/>
+              <w:top w:w="100" w:type="dxa"/>
+              <w:bottom w:w="100" w:type="dxa"/>
               <w:left w:w="130" w:type="dxa"/>
               <w:right w:w="130" w:type="dxa"/>
             </w:tcMar>
             <w:tcBorders>
               <w:top w:val="single" w:sz="4" w:space="0" w:color="D9B2B2"/>
-              <w:left w:val="single" w:sz="4" w:space="0" w:color="D9B2B2"/>
+              <w:left w:val="none"/>
               <w:bottom w:val="single" w:sz="4" w:space="0" w:color="D9B2B2"/>
-              <w:right w:val="single" w:sz="4" w:space="0" w:color="D9B2B2"/>
+              <w:right w:val="none"/>
             </w:tcBorders>
           </w:tcPr>
           <w:p>
             <w:pPr>
-              <w:spacing w:before="0" w:after="0" w:line="288" w:lineRule="auto"/>
-              <w:jc w:val="left"/>
+              <w:spacing w:before="0" w:after="0" w:line="276" w:lineRule="auto"/>
             </w:pPr>
             <w:r>
               <w:rPr>
                 <w:rFonts w:ascii="Calibri" w:hAnsi="Calibri"/>
-                <w:color w:val="232832"/>
-                <w:sz w:val="19"/>
+                <w:color w:val="232323"/>
+                <w:sz w:val="20"/>
               </w:rPr>
               <w:t>Apolinario Mabini</w:t>
             </w:r>
@@ -1879,30 +1772,29 @@
         <w:tc>
           <w:tcPr>
             <w:tcW w:type="dxa" w:w="3312"/>
-            <w:shd w:fill="FAF5F5"/>
+            <w:shd w:fill="FDF7F7"/>
             <w:tcMar>
-              <w:top w:w="80" w:type="dxa"/>
-              <w:bottom w:w="80" w:type="dxa"/>
+              <w:top w:w="100" w:type="dxa"/>
+              <w:bottom w:w="100" w:type="dxa"/>
               <w:left w:w="130" w:type="dxa"/>
               <w:right w:w="130" w:type="dxa"/>
             </w:tcMar>
             <w:tcBorders>
               <w:top w:val="single" w:sz="4" w:space="0" w:color="D9B2B2"/>
-              <w:left w:val="single" w:sz="4" w:space="0" w:color="D9B2B2"/>
+              <w:left w:val="none"/>
               <w:bottom w:val="single" w:sz="4" w:space="0" w:color="D9B2B2"/>
-              <w:right w:val="single" w:sz="4" w:space="0" w:color="D9B2B2"/>
+              <w:right w:val="none"/>
             </w:tcBorders>
           </w:tcPr>
           <w:p>
             <w:pPr>
-              <w:spacing w:before="0" w:after="0" w:line="288" w:lineRule="auto"/>
-              <w:jc w:val="left"/>
+              <w:spacing w:before="0" w:after="0" w:line="276" w:lineRule="auto"/>
             </w:pPr>
             <w:r>
               <w:rPr>
                 <w:rFonts w:ascii="Calibri" w:hAnsi="Calibri"/>
-                <w:color w:val="232832"/>
-                <w:sz w:val="19"/>
+                <w:color w:val="232323"/>
+                <w:sz w:val="20"/>
               </w:rPr>
               <w:t>Secretary of Reconstituted Liga</w:t>
             </w:r>
@@ -1911,30 +1803,29 @@
         <w:tc>
           <w:tcPr>
             <w:tcW w:type="dxa" w:w="3456"/>
-            <w:shd w:fill="FAF5F5"/>
+            <w:shd w:fill="FDF7F7"/>
             <w:tcMar>
-              <w:top w:w="80" w:type="dxa"/>
-              <w:bottom w:w="80" w:type="dxa"/>
+              <w:top w:w="100" w:type="dxa"/>
+              <w:bottom w:w="100" w:type="dxa"/>
               <w:left w:w="130" w:type="dxa"/>
               <w:right w:w="130" w:type="dxa"/>
             </w:tcMar>
             <w:tcBorders>
               <w:top w:val="single" w:sz="4" w:space="0" w:color="D9B2B2"/>
-              <w:left w:val="single" w:sz="4" w:space="0" w:color="D9B2B2"/>
+              <w:left w:val="none"/>
               <w:bottom w:val="single" w:sz="4" w:space="0" w:color="D9B2B2"/>
-              <w:right w:val="single" w:sz="4" w:space="0" w:color="D9B2B2"/>
+              <w:right w:val="none"/>
             </w:tcBorders>
           </w:tcPr>
           <w:p>
             <w:pPr>
-              <w:spacing w:before="0" w:after="0" w:line="288" w:lineRule="auto"/>
-              <w:jc w:val="left"/>
+              <w:spacing w:before="0" w:after="0" w:line="276" w:lineRule="auto"/>
             </w:pPr>
             <w:r>
               <w:rPr>
                 <w:rFonts w:ascii="Calibri" w:hAnsi="Calibri"/>
-                <w:color w:val="232832"/>
-                <w:sz w:val="19"/>
+                <w:color w:val="232323"/>
+                <w:sz w:val="20"/>
               </w:rPr>
               <w:t>Known as 'Brains of the Revolution'; guided Aguinaldo's government</w:t>
             </w:r>
@@ -1947,28 +1838,27 @@
             <w:tcW w:type="dxa" w:w="2592"/>
             <w:shd w:fill="FFFFFF"/>
             <w:tcMar>
-              <w:top w:w="80" w:type="dxa"/>
-              <w:bottom w:w="80" w:type="dxa"/>
+              <w:top w:w="100" w:type="dxa"/>
+              <w:bottom w:w="100" w:type="dxa"/>
               <w:left w:w="130" w:type="dxa"/>
               <w:right w:w="130" w:type="dxa"/>
             </w:tcMar>
             <w:tcBorders>
               <w:top w:val="single" w:sz="4" w:space="0" w:color="D9B2B2"/>
-              <w:left w:val="single" w:sz="4" w:space="0" w:color="D9B2B2"/>
+              <w:left w:val="none"/>
               <w:bottom w:val="single" w:sz="4" w:space="0" w:color="D9B2B2"/>
-              <w:right w:val="single" w:sz="4" w:space="0" w:color="D9B2B2"/>
+              <w:right w:val="none"/>
             </w:tcBorders>
           </w:tcPr>
           <w:p>
             <w:pPr>
-              <w:spacing w:before="0" w:after="0" w:line="288" w:lineRule="auto"/>
-              <w:jc w:val="left"/>
+              <w:spacing w:before="0" w:after="0" w:line="276" w:lineRule="auto"/>
             </w:pPr>
             <w:r>
               <w:rPr>
                 <w:rFonts w:ascii="Calibri" w:hAnsi="Calibri"/>
-                <w:color w:val="232832"/>
-                <w:sz w:val="19"/>
+                <w:color w:val="232323"/>
+                <w:sz w:val="20"/>
               </w:rPr>
               <w:t>Doroteo Ongjungco</w:t>
             </w:r>
@@ -1979,28 +1869,27 @@
             <w:tcW w:type="dxa" w:w="3312"/>
             <w:shd w:fill="FFFFFF"/>
             <w:tcMar>
-              <w:top w:w="80" w:type="dxa"/>
-              <w:bottom w:w="80" w:type="dxa"/>
+              <w:top w:w="100" w:type="dxa"/>
+              <w:bottom w:w="100" w:type="dxa"/>
               <w:left w:w="130" w:type="dxa"/>
               <w:right w:w="130" w:type="dxa"/>
             </w:tcMar>
             <w:tcBorders>
               <w:top w:val="single" w:sz="4" w:space="0" w:color="D9B2B2"/>
-              <w:left w:val="single" w:sz="4" w:space="0" w:color="D9B2B2"/>
+              <w:left w:val="none"/>
               <w:bottom w:val="single" w:sz="4" w:space="0" w:color="D9B2B2"/>
-              <w:right w:val="single" w:sz="4" w:space="0" w:color="D9B2B2"/>
+              <w:right w:val="none"/>
             </w:tcBorders>
           </w:tcPr>
           <w:p>
             <w:pPr>
-              <w:spacing w:before="0" w:after="0" w:line="288" w:lineRule="auto"/>
-              <w:jc w:val="left"/>
+              <w:spacing w:before="0" w:after="0" w:line="276" w:lineRule="auto"/>
             </w:pPr>
             <w:r>
               <w:rPr>
                 <w:rFonts w:ascii="Calibri" w:hAnsi="Calibri"/>
-                <w:color w:val="232832"/>
-                <w:sz w:val="19"/>
+                <w:color w:val="232323"/>
+                <w:sz w:val="20"/>
               </w:rPr>
               <w:t>Host of Inaugural Meeting</w:t>
             </w:r>
@@ -2011,28 +1900,27 @@
             <w:tcW w:type="dxa" w:w="3456"/>
             <w:shd w:fill="FFFFFF"/>
             <w:tcMar>
-              <w:top w:w="80" w:type="dxa"/>
-              <w:bottom w:w="80" w:type="dxa"/>
+              <w:top w:w="100" w:type="dxa"/>
+              <w:bottom w:w="100" w:type="dxa"/>
               <w:left w:w="130" w:type="dxa"/>
               <w:right w:w="130" w:type="dxa"/>
             </w:tcMar>
             <w:tcBorders>
               <w:top w:val="single" w:sz="4" w:space="0" w:color="D9B2B2"/>
-              <w:left w:val="single" w:sz="4" w:space="0" w:color="D9B2B2"/>
+              <w:left w:val="none"/>
               <w:bottom w:val="single" w:sz="4" w:space="0" w:color="D9B2B2"/>
-              <w:right w:val="single" w:sz="4" w:space="0" w:color="D9B2B2"/>
+              <w:right w:val="none"/>
             </w:tcBorders>
           </w:tcPr>
           <w:p>
             <w:pPr>
-              <w:spacing w:before="0" w:after="0" w:line="288" w:lineRule="auto"/>
-              <w:jc w:val="left"/>
+              <w:spacing w:before="0" w:after="0" w:line="276" w:lineRule="auto"/>
             </w:pPr>
             <w:r>
               <w:rPr>
                 <w:rFonts w:ascii="Calibri" w:hAnsi="Calibri"/>
-                <w:color w:val="232832"/>
-                <w:sz w:val="19"/>
+                <w:color w:val="232323"/>
+                <w:sz w:val="20"/>
               </w:rPr>
               <w:t>Patriot who opened his home in Tondo for reformist leaders</w:t>
             </w:r>
@@ -2042,20 +1930,20 @@
     </w:tbl>
     <w:p>
       <w:pPr>
-        <w:spacing w:before="0" w:after="80" w:line="312" w:lineRule="auto"/>
+        <w:spacing w:before="0" w:after="80" w:line="300" w:lineRule="auto"/>
       </w:pPr>
       <w:r>
         <w:rPr>
           <w:rFonts w:ascii="Calibri" w:hAnsi="Calibri"/>
-          <w:color w:val="232832"/>
+          <w:color w:val="323232"/>
           <w:sz w:val="22"/>
         </w:rPr>
-        <w:t>After Rizal's arrest, La Liga split into two distinct branches with opposing philosophies:</w:t>
+        <w:t>After Rizal's arrest and deportation to Dapitan, La Liga split into two distinct branches:</w:t>
       </w:r>
     </w:p>
     <w:p>
       <w:pPr>
-        <w:spacing w:before="0" w:after="80" w:line="312" w:lineRule="auto"/>
+        <w:spacing w:before="0" w:after="80" w:line="300" w:lineRule="auto"/>
         <w:ind w:left="360"/>
       </w:pPr>
       <w:r>
@@ -2063,14 +1951,14 @@
           <w:rFonts w:ascii="Calibri" w:hAnsi="Calibri"/>
           <w:b/>
           <w:color w:val="7A1C1C"/>
-          <w:sz w:val="22"/>
+          <w:sz w:val="20"/>
         </w:rPr>
-        <w:t xml:space="preserve">•  </w:t>
+        <w:t xml:space="preserve">▪  </w:t>
       </w:r>
       <w:r>
         <w:rPr>
           <w:rFonts w:ascii="Calibri" w:hAnsi="Calibri"/>
-          <w:color w:val="232832"/>
+          <w:color w:val="323232"/>
           <w:sz w:val="22"/>
         </w:rPr>
         <w:t>Katipunan (KKK): Radical members led by Bonifacio who abandoned peaceful reform and chose armed revolution.</w:t>
@@ -2078,7 +1966,7 @@
     </w:p>
     <w:p>
       <w:pPr>
-        <w:spacing w:before="0" w:after="80" w:line="312" w:lineRule="auto"/>
+        <w:spacing w:before="0" w:after="80" w:line="300" w:lineRule="auto"/>
         <w:ind w:left="360"/>
       </w:pPr>
       <w:r>
@@ -2086,14 +1974,14 @@
           <w:rFonts w:ascii="Calibri" w:hAnsi="Calibri"/>
           <w:b/>
           <w:color w:val="7A1C1C"/>
-          <w:sz w:val="22"/>
+          <w:sz w:val="20"/>
         </w:rPr>
-        <w:t xml:space="preserve">•  </w:t>
+        <w:t xml:space="preserve">▪  </w:t>
       </w:r>
       <w:r>
         <w:rPr>
           <w:rFonts w:ascii="Calibri" w:hAnsi="Calibri"/>
-          <w:color w:val="232832"/>
+          <w:color w:val="323232"/>
           <w:sz w:val="22"/>
         </w:rPr>
         <w:t>Cuerpo de Compromisarios: Conservative wealthy members led by Domingo Franco who continued financing La Solidaridad.</w:t>
@@ -2144,7 +2032,7 @@
             <w:r>
               <w:rPr>
                 <w:rFonts w:ascii="Calibri" w:hAnsi="Calibri"/>
-                <w:color w:val="232832"/>
+                <w:color w:val="282828"/>
                 <w:sz w:val="21"/>
               </w:rPr>
               <w:t>The conservative faction of the dissolved La Liga Filipina that chose not to join the armed revolution, pledging instead to continue funding the peaceful reform newspaper La Solidaridad in Madrid.</w:t>
@@ -2203,7 +2091,7 @@
                 <w:color w:val="FFFFFF"/>
                 <w:sz w:val="25"/>
               </w:rPr>
-              <w:t>TOPIC 3: EXILE IN DAPITAN (JULY 17, 1892 – JULY 31, 1896)</w:t>
+              <w:t>TOPIC 3: RIZAL AND THE PHILIPPINE REVOLUTION (04 HANDOUT 2A)</w:t>
             </w:r>
           </w:p>
         </w:tc>
@@ -2216,20 +2104,20 @@
     </w:p>
     <w:p>
       <w:pPr>
-        <w:spacing w:before="0" w:after="80" w:line="312" w:lineRule="auto"/>
+        <w:spacing w:before="0" w:after="80" w:line="300" w:lineRule="auto"/>
       </w:pPr>
       <w:r>
         <w:rPr>
           <w:rFonts w:ascii="Calibri" w:hAnsi="Calibri"/>
-          <w:color w:val="232832"/>
+          <w:color w:val="323232"/>
           <w:sz w:val="22"/>
         </w:rPr>
-        <w:t>Rizal spent exactly four years and fourteen days in exile in Dapitan, Zamboanga del Norte. Rather than succumbing to despair, he transformed the isolated town into a progressive community.</w:t>
+        <w:t>While Jose Rizal did not participate in armed combat during the 1896 Philippine Revolution, his political writings, intellectual philosophy, and martyrdom were the fundamental catalysts that inspired the uprising.</w:t>
       </w:r>
     </w:p>
     <w:p>
       <w:pPr>
-        <w:spacing w:before="0" w:after="80" w:line="312" w:lineRule="auto"/>
+        <w:spacing w:before="0" w:after="80" w:line="300" w:lineRule="auto"/>
         <w:ind w:left="360"/>
       </w:pPr>
       <w:r>
@@ -2237,31 +2125,22 @@
           <w:rFonts w:ascii="Calibri" w:hAnsi="Calibri"/>
           <w:b/>
           <w:color w:val="7A1C1C"/>
-          <w:sz w:val="22"/>
+          <w:sz w:val="20"/>
         </w:rPr>
-        <w:t xml:space="preserve">•  </w:t>
+        <w:t xml:space="preserve">▪  </w:t>
       </w:r>
       <w:r>
         <w:rPr>
           <w:rFonts w:ascii="Calibri" w:hAnsi="Calibri"/>
-          <w:b/>
-          <w:color w:val="191E28"/>
+          <w:color w:val="323232"/>
           <w:sz w:val="22"/>
         </w:rPr>
-        <w:t xml:space="preserve">Arrival in Dapitan: </w:t>
-      </w:r>
-      <w:r>
-        <w:rPr>
-          <w:rFonts w:ascii="Calibri" w:hAnsi="Calibri"/>
-          <w:color w:val="232832"/>
-          <w:sz w:val="22"/>
-        </w:rPr>
-        <w:t>July 17, 1892</w:t>
+        <w:t>Writings Exposed Brutality: Noli Me Tangere and El Filibusterismo stripped away the facade of Spanish colonial benevolence, showing Filipinos the urgency of liberation.</w:t>
       </w:r>
     </w:p>
     <w:p>
       <w:pPr>
-        <w:spacing w:before="0" w:after="80" w:line="312" w:lineRule="auto"/>
+        <w:spacing w:before="0" w:after="80" w:line="300" w:lineRule="auto"/>
         <w:ind w:left="360"/>
       </w:pPr>
       <w:r>
@@ -2269,22 +2148,22 @@
           <w:rFonts w:ascii="Calibri" w:hAnsi="Calibri"/>
           <w:b/>
           <w:color w:val="7A1C1C"/>
-          <w:sz w:val="22"/>
+          <w:sz w:val="20"/>
         </w:rPr>
-        <w:t xml:space="preserve">•  </w:t>
+        <w:t xml:space="preserve">▪  </w:t>
       </w:r>
       <w:r>
         <w:rPr>
           <w:rFonts w:ascii="Calibri" w:hAnsi="Calibri"/>
-          <w:color w:val="232832"/>
+          <w:color w:val="323232"/>
           <w:sz w:val="22"/>
         </w:rPr>
-        <w:t>Brought under military guard aboard the steamer Cebu.</w:t>
+        <w:t>Martyrdom as Catalyst: Rizal's death by firing squad became a powerful symbol of colonial tyranny, rallying thousands of hesitant Filipinos into joining the revolution.</w:t>
       </w:r>
     </w:p>
     <w:p>
       <w:pPr>
-        <w:spacing w:before="0" w:after="80" w:line="312" w:lineRule="auto"/>
+        <w:spacing w:before="0" w:after="80" w:line="300" w:lineRule="auto"/>
         <w:ind w:left="360"/>
       </w:pPr>
       <w:r>
@@ -2292,49 +2171,17 @@
           <w:rFonts w:ascii="Calibri" w:hAnsi="Calibri"/>
           <w:b/>
           <w:color w:val="7A1C1C"/>
-          <w:sz w:val="22"/>
+          <w:sz w:val="20"/>
         </w:rPr>
-        <w:t xml:space="preserve">•  </w:t>
+        <w:t xml:space="preserve">▪  </w:t>
       </w:r>
       <w:r>
         <w:rPr>
           <w:rFonts w:ascii="Calibri" w:hAnsi="Calibri"/>
-          <w:b/>
-          <w:color w:val="191E28"/>
+          <w:color w:val="323232"/>
           <w:sz w:val="22"/>
         </w:rPr>
-        <w:t xml:space="preserve">Departure from Dapitan: </w:t>
-      </w:r>
-      <w:r>
-        <w:rPr>
-          <w:rFonts w:ascii="Calibri" w:hAnsi="Calibri"/>
-          <w:color w:val="232832"/>
-          <w:sz w:val="22"/>
-        </w:rPr>
-        <w:t>July 31, 1896</w:t>
-      </w:r>
-    </w:p>
-    <w:p>
-      <w:pPr>
-        <w:spacing w:before="0" w:after="80" w:line="312" w:lineRule="auto"/>
-        <w:ind w:left="360"/>
-      </w:pPr>
-      <w:r>
-        <w:rPr>
-          <w:rFonts w:ascii="Calibri" w:hAnsi="Calibri"/>
-          <w:b/>
-          <w:color w:val="7A1C1C"/>
-          <w:sz w:val="22"/>
-        </w:rPr>
-        <w:t xml:space="preserve">•  </w:t>
-      </w:r>
-      <w:r>
-        <w:rPr>
-          <w:rFonts w:ascii="Calibri" w:hAnsi="Calibri"/>
-          <w:color w:val="232832"/>
-          <w:sz w:val="22"/>
-        </w:rPr>
-        <w:t>Completed his four-year sentence and sailed for Manila to proceed to Cuba.</w:t>
+        <w:t>Katipunan's Inspiration: Andres Bonifacio and the revolutionaries looked up to Rizal as their honorary leader, utilizing his name as the secret password for Katipunan third-grade members ('Bayani').</w:t>
       </w:r>
     </w:p>
     <w:tbl>
@@ -2345,14 +2192,376 @@
         <w:tblLook w:firstColumn="1" w:firstRow="1" w:lastColumn="0" w:lastRow="0" w:noHBand="0" w:noVBand="1" w:val="04A0"/>
       </w:tblPr>
       <w:tblGrid>
-        <w:gridCol w:w="4680"/>
-        <w:gridCol w:w="4680"/>
+        <w:gridCol w:w="9360"/>
       </w:tblGrid>
       <w:tr>
         <w:tc>
           <w:tcPr>
-            <w:tcW w:type="dxa" w:w="2880"/>
+            <w:tcW w:type="dxa" w:w="9360"/>
+            <w:shd w:fill="F9EDED"/>
+            <w:tcMar>
+              <w:top w:w="130" w:type="dxa"/>
+              <w:bottom w:w="130" w:type="dxa"/>
+              <w:left w:w="170" w:type="dxa"/>
+              <w:right w:w="170" w:type="dxa"/>
+            </w:tcMar>
+            <w:tcBorders>
+              <w:top w:val="none"/>
+              <w:left w:val="single" w:sz="24" w:space="0" w:color="7A1C1C"/>
+              <w:bottom w:val="none"/>
+              <w:right w:val="none"/>
+            </w:tcBorders>
+          </w:tcPr>
+          <w:p>
+            <w:pPr>
+              <w:spacing w:before="0" w:after="40" w:line="288" w:lineRule="auto"/>
+            </w:pPr>
+            <w:r>
+              <w:rPr>
+                <w:rFonts w:ascii="Calibri" w:hAnsi="Calibri"/>
+                <w:b/>
+                <w:color w:val="7A1C1C"/>
+                <w:sz w:val="22"/>
+              </w:rPr>
+              <w:t>KEY DEFINITION: Filipinismo</w:t>
+              <w:br/>
+            </w:r>
+            <w:r>
+              <w:rPr>
+                <w:rFonts w:ascii="Calibri" w:hAnsi="Calibri"/>
+                <w:color w:val="282828"/>
+                <w:sz w:val="21"/>
+              </w:rPr>
+              <w:t>Rizal's concept of national identity that is distinct and independent from Spanish colonial culture. It emphasizes pride in indigenous Filipino history, cultural unity across linguistic barriers, and self-worth rather than Spanish assimilation.</w:t>
+            </w:r>
+          </w:p>
+        </w:tc>
+      </w:tr>
+    </w:tbl>
+    <w:p>
+      <w:pPr>
+        <w:spacing w:before="60" w:after="60" w:line="240" w:lineRule="auto"/>
+      </w:pPr>
+    </w:p>
+    <w:p>
+      <w:pPr>
+        <w:spacing w:before="0" w:after="80" w:line="300" w:lineRule="auto"/>
+      </w:pPr>
+      <w:r>
+        <w:rPr>
+          <w:rFonts w:ascii="Calibri" w:hAnsi="Calibri"/>
+          <w:b/>
+          <w:color w:val="1E1E1E"/>
+          <w:sz w:val="22"/>
+        </w:rPr>
+        <w:t xml:space="preserve">Nationalism Through Education: </w:t>
+      </w:r>
+      <w:r>
+        <w:rPr>
+          <w:rFonts w:ascii="Calibri" w:hAnsi="Calibri"/>
+          <w:color w:val="323232"/>
+          <w:sz w:val="22"/>
+        </w:rPr>
+        <w:t>Rizal's Concept of Intellectual Nationalism:</w:t>
+      </w:r>
+    </w:p>
+    <w:p>
+      <w:pPr>
+        <w:spacing w:before="0" w:after="80" w:line="300" w:lineRule="auto"/>
+        <w:ind w:left="360"/>
+      </w:pPr>
+      <w:r>
+        <w:rPr>
+          <w:rFonts w:ascii="Calibri" w:hAnsi="Calibri"/>
+          <w:b/>
+          <w:color w:val="7A1C1C"/>
+          <w:sz w:val="20"/>
+        </w:rPr>
+        <w:t xml:space="preserve">▪  </w:t>
+      </w:r>
+      <w:r>
+        <w:rPr>
+          <w:rFonts w:ascii="Calibri" w:hAnsi="Calibri"/>
+          <w:color w:val="323232"/>
+          <w:sz w:val="22"/>
+        </w:rPr>
+        <w:t>Rizal believed that true independence was impossible without prior intellectual and moral preparation.</w:t>
+      </w:r>
+    </w:p>
+    <w:p>
+      <w:pPr>
+        <w:spacing w:before="0" w:after="80" w:line="300" w:lineRule="auto"/>
+        <w:ind w:left="360"/>
+      </w:pPr>
+      <w:r>
+        <w:rPr>
+          <w:rFonts w:ascii="Calibri" w:hAnsi="Calibri"/>
+          <w:b/>
+          <w:color w:val="7A1C1C"/>
+          <w:sz w:val="20"/>
+        </w:rPr>
+        <w:t xml:space="preserve">▪  </w:t>
+      </w:r>
+      <w:r>
+        <w:rPr>
+          <w:rFonts w:ascii="Calibri" w:hAnsi="Calibri"/>
+          <w:color w:val="323232"/>
+          <w:sz w:val="22"/>
+        </w:rPr>
+        <w:t>Enlightenment Influence: European Enlightenment taught Rizal that reason, equality, and civic awareness form the bedrock of self-governance.</w:t>
+      </w:r>
+    </w:p>
+    <w:p>
+      <w:pPr>
+        <w:spacing w:before="0" w:after="80" w:line="300" w:lineRule="auto"/>
+        <w:ind w:left="360"/>
+      </w:pPr>
+      <w:r>
+        <w:rPr>
+          <w:rFonts w:ascii="Calibri" w:hAnsi="Calibri"/>
+          <w:b/>
+          <w:color w:val="7A1C1C"/>
+          <w:sz w:val="20"/>
+        </w:rPr>
+        <w:t xml:space="preserve">▪  </w:t>
+      </w:r>
+      <w:r>
+        <w:rPr>
+          <w:rFonts w:ascii="Calibri" w:hAnsi="Calibri"/>
+          <w:color w:val="323232"/>
+          <w:sz w:val="22"/>
+        </w:rPr>
+        <w:t>Education as Decolonization: Simply removing foreign rulers without educating the masses would merely replace Spanish tyrants with domestic oppressors ('The slaves of today will be the tyrants of tomorrow').</w:t>
+      </w:r>
+    </w:p>
+    <w:p>
+      <w:pPr>
+        <w:spacing w:before="0" w:after="80" w:line="300" w:lineRule="auto"/>
+        <w:ind w:left="360"/>
+      </w:pPr>
+      <w:r>
+        <w:rPr>
+          <w:rFonts w:ascii="Calibri" w:hAnsi="Calibri"/>
+          <w:b/>
+          <w:color w:val="7A1C1C"/>
+          <w:sz w:val="20"/>
+        </w:rPr>
+        <w:t xml:space="preserve">▪  </w:t>
+      </w:r>
+      <w:r>
+        <w:rPr>
+          <w:rFonts w:ascii="Calibri" w:hAnsi="Calibri"/>
+          <w:color w:val="323232"/>
+          <w:sz w:val="22"/>
+        </w:rPr>
+        <w:t>National Unity: A diverse nation of islands can only triumph if Filipinos recognize their shared identity and work cooperatively through mutual respect and dialogue.</w:t>
+      </w:r>
+    </w:p>
+    <w:tbl>
+      <w:tblPr>
+        <w:tblW w:type="auto" w:w="0"/>
+        <w:jc w:val="center"/>
+        <w:tblLayout w:type="fixed"/>
+        <w:tblLook w:firstColumn="1" w:firstRow="1" w:lastColumn="0" w:lastRow="0" w:noHBand="0" w:noVBand="1" w:val="04A0"/>
+      </w:tblPr>
+      <w:tblGrid>
+        <w:gridCol w:w="9360"/>
+      </w:tblGrid>
+      <w:tr>
+        <w:tc>
+          <w:tcPr>
+            <w:tcW w:type="dxa" w:w="9360"/>
+            <w:shd w:fill="F9EDED"/>
+            <w:tcMar>
+              <w:top w:w="130" w:type="dxa"/>
+              <w:bottom w:w="130" w:type="dxa"/>
+              <w:left w:w="170" w:type="dxa"/>
+              <w:right w:w="170" w:type="dxa"/>
+            </w:tcMar>
+            <w:tcBorders>
+              <w:top w:val="none"/>
+              <w:left w:val="single" w:sz="24" w:space="0" w:color="7A1C1C"/>
+              <w:bottom w:val="none"/>
+              <w:right w:val="none"/>
+            </w:tcBorders>
+          </w:tcPr>
+          <w:p>
+            <w:pPr>
+              <w:spacing w:before="0" w:after="40" w:line="288" w:lineRule="auto"/>
+            </w:pPr>
+            <w:r>
+              <w:rPr>
+                <w:rFonts w:ascii="Calibri" w:hAnsi="Calibri"/>
+                <w:b/>
+                <w:color w:val="7A1C1C"/>
+                <w:sz w:val="22"/>
+              </w:rPr>
+              <w:t>KEY DEFINITION: Intellectual Nationalism</w:t>
+              <w:br/>
+            </w:r>
+            <w:r>
+              <w:rPr>
+                <w:rFonts w:ascii="Calibri" w:hAnsi="Calibri"/>
+                <w:color w:val="282828"/>
+                <w:sz w:val="21"/>
+              </w:rPr>
+              <w:t>Rizal's doctrine that national freedom must begin with the moral and mental awakening of the citizenry through education, modern science, and civic duty, rather than premature and bloody rebellion.</w:t>
+            </w:r>
+          </w:p>
+        </w:tc>
+      </w:tr>
+    </w:tbl>
+    <w:p>
+      <w:pPr>
+        <w:spacing w:before="60" w:after="60" w:line="240" w:lineRule="auto"/>
+      </w:pPr>
+    </w:p>
+    <w:p>
+      <w:pPr>
+        <w:spacing w:before="0" w:after="80" w:line="300" w:lineRule="auto"/>
+      </w:pPr>
+      <w:r>
+        <w:rPr>
+          <w:rFonts w:ascii="Calibri" w:hAnsi="Calibri"/>
+          <w:b/>
+          <w:color w:val="1E1E1E"/>
+          <w:sz w:val="22"/>
+        </w:rPr>
+        <w:t xml:space="preserve">Comparative Analysis: </w:t>
+      </w:r>
+      <w:r>
+        <w:rPr>
+          <w:rFonts w:ascii="Calibri" w:hAnsi="Calibri"/>
+          <w:color w:val="323232"/>
+          <w:sz w:val="22"/>
+        </w:rPr>
+        <w:t>Rizal's Philosophy Contrasted with Other Revolutionary Leaders:</w:t>
+      </w:r>
+    </w:p>
+    <w:tbl>
+      <w:tblPr>
+        <w:tblW w:type="auto" w:w="0"/>
+        <w:jc w:val="center"/>
+        <w:tblLayout w:type="fixed"/>
+        <w:tblLook w:firstColumn="1" w:firstRow="1" w:lastColumn="0" w:lastRow="0" w:noHBand="0" w:noVBand="1" w:val="04A0"/>
+      </w:tblPr>
+      <w:tblGrid>
+        <w:gridCol w:w="2340"/>
+        <w:gridCol w:w="2340"/>
+        <w:gridCol w:w="2340"/>
+        <w:gridCol w:w="2340"/>
+      </w:tblGrid>
+      <w:tr>
+        <w:tc>
+          <w:tcPr>
+            <w:tcW w:type="dxa" w:w="2016"/>
             <w:shd w:fill="7A1C1C"/>
+            <w:tcMar>
+              <w:top w:w="120" w:type="dxa"/>
+              <w:bottom w:w="120" w:type="dxa"/>
+              <w:left w:w="140" w:type="dxa"/>
+              <w:right w:w="140" w:type="dxa"/>
+            </w:tcMar>
+          </w:tcPr>
+          <w:p>
+            <w:pPr>
+              <w:spacing w:before="0" w:after="0" w:line="276" w:lineRule="auto"/>
+            </w:pPr>
+            <w:r>
+              <w:rPr>
+                <w:rFonts w:ascii="Calibri" w:hAnsi="Calibri"/>
+                <w:b/>
+                <w:color w:val="FFFFFF"/>
+                <w:sz w:val="21"/>
+              </w:rPr>
+              <w:t>Leader</w:t>
+            </w:r>
+          </w:p>
+        </w:tc>
+        <w:tc>
+          <w:tcPr>
+            <w:tcW w:type="dxa" w:w="2592"/>
+            <w:shd w:fill="7A1C1C"/>
+            <w:tcMar>
+              <w:top w:w="120" w:type="dxa"/>
+              <w:bottom w:w="120" w:type="dxa"/>
+              <w:left w:w="140" w:type="dxa"/>
+              <w:right w:w="140" w:type="dxa"/>
+            </w:tcMar>
+          </w:tcPr>
+          <w:p>
+            <w:pPr>
+              <w:spacing w:before="0" w:after="0" w:line="276" w:lineRule="auto"/>
+            </w:pPr>
+            <w:r>
+              <w:rPr>
+                <w:rFonts w:ascii="Calibri" w:hAnsi="Calibri"/>
+                <w:b/>
+                <w:color w:val="FFFFFF"/>
+                <w:sz w:val="21"/>
+              </w:rPr>
+              <w:t>Primary Philosophy</w:t>
+            </w:r>
+          </w:p>
+        </w:tc>
+        <w:tc>
+          <w:tcPr>
+            <w:tcW w:type="dxa" w:w="2592"/>
+            <w:shd w:fill="7A1C1C"/>
+            <w:tcMar>
+              <w:top w:w="120" w:type="dxa"/>
+              <w:bottom w:w="120" w:type="dxa"/>
+              <w:left w:w="140" w:type="dxa"/>
+              <w:right w:w="140" w:type="dxa"/>
+            </w:tcMar>
+          </w:tcPr>
+          <w:p>
+            <w:pPr>
+              <w:spacing w:before="0" w:after="0" w:line="276" w:lineRule="auto"/>
+            </w:pPr>
+            <w:r>
+              <w:rPr>
+                <w:rFonts w:ascii="Calibri" w:hAnsi="Calibri"/>
+                <w:b/>
+                <w:color w:val="FFFFFF"/>
+                <w:sz w:val="21"/>
+              </w:rPr>
+              <w:t>Tactical Approach</w:t>
+            </w:r>
+          </w:p>
+        </w:tc>
+        <w:tc>
+          <w:tcPr>
+            <w:tcW w:type="dxa" w:w="2160"/>
+            <w:shd w:fill="7A1C1C"/>
+            <w:tcMar>
+              <w:top w:w="120" w:type="dxa"/>
+              <w:bottom w:w="120" w:type="dxa"/>
+              <w:left w:w="140" w:type="dxa"/>
+              <w:right w:w="140" w:type="dxa"/>
+            </w:tcMar>
+          </w:tcPr>
+          <w:p>
+            <w:pPr>
+              <w:spacing w:before="0" w:after="0" w:line="276" w:lineRule="auto"/>
+            </w:pPr>
+            <w:r>
+              <w:rPr>
+                <w:rFonts w:ascii="Calibri" w:hAnsi="Calibri"/>
+                <w:b/>
+                <w:color w:val="FFFFFF"/>
+                <w:sz w:val="21"/>
+              </w:rPr>
+              <w:t>View on Armed Revolution</w:t>
+            </w:r>
+          </w:p>
+        </w:tc>
+      </w:tr>
+      <w:tr>
+        <w:tc>
+          <w:tcPr>
+            <w:tcW w:type="dxa" w:w="2016"/>
+            <w:shd w:fill="FFFFFF"/>
             <w:tcMar>
               <w:top w:w="100" w:type="dxa"/>
               <w:bottom w:w="100" w:type="dxa"/>
@@ -2361,31 +2570,29 @@
             </w:tcMar>
             <w:tcBorders>
               <w:top w:val="single" w:sz="4" w:space="0" w:color="D9B2B2"/>
-              <w:left w:val="single" w:sz="4" w:space="0" w:color="D9B2B2"/>
+              <w:left w:val="none"/>
               <w:bottom w:val="single" w:sz="4" w:space="0" w:color="D9B2B2"/>
-              <w:right w:val="single" w:sz="4" w:space="0" w:color="D9B2B2"/>
+              <w:right w:val="none"/>
             </w:tcBorders>
           </w:tcPr>
           <w:p>
             <w:pPr>
-              <w:spacing w:before="0" w:after="0"/>
-              <w:jc w:val="left"/>
+              <w:spacing w:before="0" w:after="0" w:line="276" w:lineRule="auto"/>
             </w:pPr>
             <w:r>
               <w:rPr>
                 <w:rFonts w:ascii="Calibri" w:hAnsi="Calibri"/>
-                <w:b/>
-                <w:color w:val="FFFFFF"/>
+                <w:color w:val="232323"/>
                 <w:sz w:val="20"/>
               </w:rPr>
-              <w:t>Field of Contribution</w:t>
+              <w:t>Jose Rizal</w:t>
             </w:r>
           </w:p>
         </w:tc>
         <w:tc>
           <w:tcPr>
-            <w:tcW w:type="dxa" w:w="6480"/>
-            <w:shd w:fill="7A1C1C"/>
+            <w:tcW w:type="dxa" w:w="2592"/>
+            <w:shd w:fill="FFFFFF"/>
             <w:tcMar>
               <w:top w:w="100" w:type="dxa"/>
               <w:bottom w:w="100" w:type="dxa"/>
@@ -2394,24 +2601,84 @@
             </w:tcMar>
             <w:tcBorders>
               <w:top w:val="single" w:sz="4" w:space="0" w:color="D9B2B2"/>
-              <w:left w:val="single" w:sz="4" w:space="0" w:color="D9B2B2"/>
+              <w:left w:val="none"/>
               <w:bottom w:val="single" w:sz="4" w:space="0" w:color="D9B2B2"/>
-              <w:right w:val="single" w:sz="4" w:space="0" w:color="D9B2B2"/>
+              <w:right w:val="none"/>
             </w:tcBorders>
           </w:tcPr>
           <w:p>
             <w:pPr>
-              <w:spacing w:before="0" w:after="0"/>
-              <w:jc w:val="left"/>
+              <w:spacing w:before="0" w:after="0" w:line="276" w:lineRule="auto"/>
             </w:pPr>
             <w:r>
               <w:rPr>
                 <w:rFonts w:ascii="Calibri" w:hAnsi="Calibri"/>
-                <w:b/>
-                <w:color w:val="FFFFFF"/>
+                <w:color w:val="232323"/>
                 <w:sz w:val="20"/>
               </w:rPr>
-              <w:t>Concrete Community Achievements in Dapitan</w:t>
+              <w:t>Intellectual enlightenment &amp; moral awakening; civic pride (Filipinismo)</w:t>
+            </w:r>
+          </w:p>
+        </w:tc>
+        <w:tc>
+          <w:tcPr>
+            <w:tcW w:type="dxa" w:w="2592"/>
+            <w:shd w:fill="FFFFFF"/>
+            <w:tcMar>
+              <w:top w:w="100" w:type="dxa"/>
+              <w:bottom w:w="100" w:type="dxa"/>
+              <w:left w:w="130" w:type="dxa"/>
+              <w:right w:w="130" w:type="dxa"/>
+            </w:tcMar>
+            <w:tcBorders>
+              <w:top w:val="single" w:sz="4" w:space="0" w:color="D9B2B2"/>
+              <w:left w:val="none"/>
+              <w:bottom w:val="single" w:sz="4" w:space="0" w:color="D9B2B2"/>
+              <w:right w:val="none"/>
+            </w:tcBorders>
+          </w:tcPr>
+          <w:p>
+            <w:pPr>
+              <w:spacing w:before="0" w:after="0" w:line="276" w:lineRule="auto"/>
+            </w:pPr>
+            <w:r>
+              <w:rPr>
+                <w:rFonts w:ascii="Calibri" w:hAnsi="Calibri"/>
+                <w:color w:val="232323"/>
+                <w:sz w:val="20"/>
+              </w:rPr>
+              <w:t>Peaceful legal reform, education, community organizing, non-violent resistance</w:t>
+            </w:r>
+          </w:p>
+        </w:tc>
+        <w:tc>
+          <w:tcPr>
+            <w:tcW w:type="dxa" w:w="2160"/>
+            <w:shd w:fill="FFFFFF"/>
+            <w:tcMar>
+              <w:top w:w="100" w:type="dxa"/>
+              <w:bottom w:w="100" w:type="dxa"/>
+              <w:left w:w="130" w:type="dxa"/>
+              <w:right w:w="130" w:type="dxa"/>
+            </w:tcMar>
+            <w:tcBorders>
+              <w:top w:val="single" w:sz="4" w:space="0" w:color="D9B2B2"/>
+              <w:left w:val="none"/>
+              <w:bottom w:val="single" w:sz="4" w:space="0" w:color="D9B2B2"/>
+              <w:right w:val="none"/>
+            </w:tcBorders>
+          </w:tcPr>
+          <w:p>
+            <w:pPr>
+              <w:spacing w:before="0" w:after="0" w:line="276" w:lineRule="auto"/>
+            </w:pPr>
+            <w:r>
+              <w:rPr>
+                <w:rFonts w:ascii="Calibri" w:hAnsi="Calibri"/>
+                <w:color w:val="232323"/>
+                <w:sz w:val="20"/>
+              </w:rPr>
+              <w:t>Opposed premature armed rebellion without firearms, navy, and proper training; favored gradual decolonization</w:t>
             </w:r>
           </w:p>
         </w:tc>
@@ -2419,65 +2686,125 @@
       <w:tr>
         <w:tc>
           <w:tcPr>
-            <w:tcW w:type="dxa" w:w="2880"/>
-            <w:shd w:fill="FFFFFF"/>
+            <w:tcW w:type="dxa" w:w="2016"/>
+            <w:shd w:fill="FDF7F7"/>
             <w:tcMar>
-              <w:top w:w="80" w:type="dxa"/>
-              <w:bottom w:w="80" w:type="dxa"/>
+              <w:top w:w="100" w:type="dxa"/>
+              <w:bottom w:w="100" w:type="dxa"/>
               <w:left w:w="130" w:type="dxa"/>
               <w:right w:w="130" w:type="dxa"/>
             </w:tcMar>
             <w:tcBorders>
               <w:top w:val="single" w:sz="4" w:space="0" w:color="D9B2B2"/>
-              <w:left w:val="single" w:sz="4" w:space="0" w:color="D9B2B2"/>
+              <w:left w:val="none"/>
               <w:bottom w:val="single" w:sz="4" w:space="0" w:color="D9B2B2"/>
-              <w:right w:val="single" w:sz="4" w:space="0" w:color="D9B2B2"/>
+              <w:right w:val="none"/>
             </w:tcBorders>
           </w:tcPr>
           <w:p>
             <w:pPr>
-              <w:spacing w:before="0" w:after="0" w:line="288" w:lineRule="auto"/>
-              <w:jc w:val="left"/>
+              <w:spacing w:before="0" w:after="0" w:line="276" w:lineRule="auto"/>
             </w:pPr>
             <w:r>
               <w:rPr>
                 <w:rFonts w:ascii="Calibri" w:hAnsi="Calibri"/>
-                <w:color w:val="232832"/>
-                <w:sz w:val="19"/>
+                <w:color w:val="232323"/>
+                <w:sz w:val="20"/>
               </w:rPr>
-              <w:t>Medicine &amp; Surgery</w:t>
+              <w:t>Andres Bonifacio</w:t>
             </w:r>
           </w:p>
         </w:tc>
         <w:tc>
           <w:tcPr>
-            <w:tcW w:type="dxa" w:w="6480"/>
-            <w:shd w:fill="FFFFFF"/>
+            <w:tcW w:type="dxa" w:w="2592"/>
+            <w:shd w:fill="FDF7F7"/>
             <w:tcMar>
-              <w:top w:w="80" w:type="dxa"/>
-              <w:bottom w:w="80" w:type="dxa"/>
+              <w:top w:w="100" w:type="dxa"/>
+              <w:bottom w:w="100" w:type="dxa"/>
               <w:left w:w="130" w:type="dxa"/>
               <w:right w:w="130" w:type="dxa"/>
             </w:tcMar>
             <w:tcBorders>
               <w:top w:val="single" w:sz="4" w:space="0" w:color="D9B2B2"/>
-              <w:left w:val="single" w:sz="4" w:space="0" w:color="D9B2B2"/>
+              <w:left w:val="none"/>
               <w:bottom w:val="single" w:sz="4" w:space="0" w:color="D9B2B2"/>
-              <w:right w:val="single" w:sz="4" w:space="0" w:color="D9B2B2"/>
+              <w:right w:val="none"/>
             </w:tcBorders>
           </w:tcPr>
           <w:p>
             <w:pPr>
-              <w:spacing w:before="0" w:after="0" w:line="288" w:lineRule="auto"/>
-              <w:jc w:val="left"/>
+              <w:spacing w:before="0" w:after="0" w:line="276" w:lineRule="auto"/>
             </w:pPr>
             <w:r>
               <w:rPr>
                 <w:rFonts w:ascii="Calibri" w:hAnsi="Calibri"/>
-                <w:color w:val="232832"/>
-                <w:sz w:val="19"/>
+                <w:color w:val="232323"/>
+                <w:sz w:val="20"/>
               </w:rPr>
-              <w:t>Provided free consultations and medicines to impoverished locals; operated successfully on his mother Teodora Alonso's cataracts; treated domestic and international patients.</w:t>
+              <w:t>Radical liberation of the working masses; complete separation from Spain</w:t>
+            </w:r>
+          </w:p>
+        </w:tc>
+        <w:tc>
+          <w:tcPr>
+            <w:tcW w:type="dxa" w:w="2592"/>
+            <w:shd w:fill="FDF7F7"/>
+            <w:tcMar>
+              <w:top w:w="100" w:type="dxa"/>
+              <w:bottom w:w="100" w:type="dxa"/>
+              <w:left w:w="130" w:type="dxa"/>
+              <w:right w:w="130" w:type="dxa"/>
+            </w:tcMar>
+            <w:tcBorders>
+              <w:top w:val="single" w:sz="4" w:space="0" w:color="D9B2B2"/>
+              <w:left w:val="none"/>
+              <w:bottom w:val="single" w:sz="4" w:space="0" w:color="D9B2B2"/>
+              <w:right w:val="none"/>
+            </w:tcBorders>
+          </w:tcPr>
+          <w:p>
+            <w:pPr>
+              <w:spacing w:before="0" w:after="0" w:line="276" w:lineRule="auto"/>
+            </w:pPr>
+            <w:r>
+              <w:rPr>
+                <w:rFonts w:ascii="Calibri" w:hAnsi="Calibri"/>
+                <w:color w:val="232323"/>
+                <w:sz w:val="20"/>
+              </w:rPr>
+              <w:t>Armed insurrection through the underground secret society (Katipunan / KKK)</w:t>
+            </w:r>
+          </w:p>
+        </w:tc>
+        <w:tc>
+          <w:tcPr>
+            <w:tcW w:type="dxa" w:w="2160"/>
+            <w:shd w:fill="FDF7F7"/>
+            <w:tcMar>
+              <w:top w:w="100" w:type="dxa"/>
+              <w:bottom w:w="100" w:type="dxa"/>
+              <w:left w:w="130" w:type="dxa"/>
+              <w:right w:w="130" w:type="dxa"/>
+            </w:tcMar>
+            <w:tcBorders>
+              <w:top w:val="single" w:sz="4" w:space="0" w:color="D9B2B2"/>
+              <w:left w:val="none"/>
+              <w:bottom w:val="single" w:sz="4" w:space="0" w:color="D9B2B2"/>
+              <w:right w:val="none"/>
+            </w:tcBorders>
+          </w:tcPr>
+          <w:p>
+            <w:pPr>
+              <w:spacing w:before="0" w:after="0" w:line="276" w:lineRule="auto"/>
+            </w:pPr>
+            <w:r>
+              <w:rPr>
+                <w:rFonts w:ascii="Calibri" w:hAnsi="Calibri"/>
+                <w:color w:val="232323"/>
+                <w:sz w:val="20"/>
+              </w:rPr>
+              <w:t>Believed armed revolution was the only viable solution; convinced Spanish tyranny would never grant peaceful reform</w:t>
             </w:r>
           </w:p>
         </w:tc>
@@ -2485,197 +2812,125 @@
       <w:tr>
         <w:tc>
           <w:tcPr>
-            <w:tcW w:type="dxa" w:w="2880"/>
-            <w:shd w:fill="FAF5F5"/>
+            <w:tcW w:type="dxa" w:w="2016"/>
+            <w:shd w:fill="FFFFFF"/>
             <w:tcMar>
-              <w:top w:w="80" w:type="dxa"/>
-              <w:bottom w:w="80" w:type="dxa"/>
+              <w:top w:w="100" w:type="dxa"/>
+              <w:bottom w:w="100" w:type="dxa"/>
               <w:left w:w="130" w:type="dxa"/>
               <w:right w:w="130" w:type="dxa"/>
             </w:tcMar>
             <w:tcBorders>
               <w:top w:val="single" w:sz="4" w:space="0" w:color="D9B2B2"/>
-              <w:left w:val="single" w:sz="4" w:space="0" w:color="D9B2B2"/>
+              <w:left w:val="none"/>
               <w:bottom w:val="single" w:sz="4" w:space="0" w:color="D9B2B2"/>
-              <w:right w:val="single" w:sz="4" w:space="0" w:color="D9B2B2"/>
+              <w:right w:val="none"/>
             </w:tcBorders>
           </w:tcPr>
           <w:p>
             <w:pPr>
-              <w:spacing w:before="0" w:after="0" w:line="288" w:lineRule="auto"/>
-              <w:jc w:val="left"/>
+              <w:spacing w:before="0" w:after="0" w:line="276" w:lineRule="auto"/>
             </w:pPr>
             <w:r>
               <w:rPr>
                 <w:rFonts w:ascii="Calibri" w:hAnsi="Calibri"/>
-                <w:color w:val="232832"/>
-                <w:sz w:val="19"/>
+                <w:color w:val="232323"/>
+                <w:sz w:val="20"/>
               </w:rPr>
-              <w:t>Education &amp; Teaching</w:t>
+              <w:t>Emilio Aguinaldo</w:t>
             </w:r>
           </w:p>
         </w:tc>
         <w:tc>
           <w:tcPr>
-            <w:tcW w:type="dxa" w:w="6480"/>
-            <w:shd w:fill="FAF5F5"/>
+            <w:tcW w:type="dxa" w:w="2592"/>
+            <w:shd w:fill="FFFFFF"/>
             <w:tcMar>
-              <w:top w:w="80" w:type="dxa"/>
-              <w:bottom w:w="80" w:type="dxa"/>
+              <w:top w:w="100" w:type="dxa"/>
+              <w:bottom w:w="100" w:type="dxa"/>
               <w:left w:w="130" w:type="dxa"/>
               <w:right w:w="130" w:type="dxa"/>
             </w:tcMar>
             <w:tcBorders>
               <w:top w:val="single" w:sz="4" w:space="0" w:color="D9B2B2"/>
-              <w:left w:val="single" w:sz="4" w:space="0" w:color="D9B2B2"/>
+              <w:left w:val="none"/>
               <w:bottom w:val="single" w:sz="4" w:space="0" w:color="D9B2B2"/>
-              <w:right w:val="single" w:sz="4" w:space="0" w:color="D9B2B2"/>
+              <w:right w:val="none"/>
             </w:tcBorders>
           </w:tcPr>
           <w:p>
             <w:pPr>
-              <w:spacing w:before="0" w:after="0" w:line="288" w:lineRule="auto"/>
-              <w:jc w:val="left"/>
+              <w:spacing w:before="0" w:after="0" w:line="276" w:lineRule="auto"/>
             </w:pPr>
             <w:r>
               <w:rPr>
                 <w:rFonts w:ascii="Calibri" w:hAnsi="Calibri"/>
-                <w:color w:val="232832"/>
-                <w:sz w:val="19"/>
+                <w:color w:val="232323"/>
+                <w:sz w:val="20"/>
               </w:rPr>
-              <w:t>Built a boys' school on his Talisay property; trained 16 young boys in academic subjects (English, Spanish, arithmetic), sports (swimming, gymnastics), and vocational skills without tuition fees.</w:t>
+              <w:t>National sovereignty through structured military leadership &amp; government</w:t>
             </w:r>
           </w:p>
         </w:tc>
-      </w:tr>
-      <w:tr>
         <w:tc>
           <w:tcPr>
-            <w:tcW w:type="dxa" w:w="2880"/>
+            <w:tcW w:type="dxa" w:w="2592"/>
             <w:shd w:fill="FFFFFF"/>
             <w:tcMar>
-              <w:top w:w="80" w:type="dxa"/>
-              <w:bottom w:w="80" w:type="dxa"/>
+              <w:top w:w="100" w:type="dxa"/>
+              <w:bottom w:w="100" w:type="dxa"/>
               <w:left w:w="130" w:type="dxa"/>
               <w:right w:w="130" w:type="dxa"/>
             </w:tcMar>
             <w:tcBorders>
               <w:top w:val="single" w:sz="4" w:space="0" w:color="D9B2B2"/>
-              <w:left w:val="single" w:sz="4" w:space="0" w:color="D9B2B2"/>
+              <w:left w:val="none"/>
               <w:bottom w:val="single" w:sz="4" w:space="0" w:color="D9B2B2"/>
-              <w:right w:val="single" w:sz="4" w:space="0" w:color="D9B2B2"/>
+              <w:right w:val="none"/>
             </w:tcBorders>
           </w:tcPr>
           <w:p>
             <w:pPr>
-              <w:spacing w:before="0" w:after="0" w:line="288" w:lineRule="auto"/>
-              <w:jc w:val="left"/>
+              <w:spacing w:before="0" w:after="0" w:line="276" w:lineRule="auto"/>
             </w:pPr>
             <w:r>
               <w:rPr>
                 <w:rFonts w:ascii="Calibri" w:hAnsi="Calibri"/>
-                <w:color w:val="232832"/>
-                <w:sz w:val="19"/>
+                <w:color w:val="232323"/>
+                <w:sz w:val="20"/>
               </w:rPr>
-              <w:t>Engineering &amp; Public Works</w:t>
+              <w:t>Conventional battlefield warfare, political maneuvering, strategic alliances</w:t>
             </w:r>
           </w:p>
         </w:tc>
         <w:tc>
           <w:tcPr>
-            <w:tcW w:type="dxa" w:w="6480"/>
+            <w:tcW w:type="dxa" w:w="2160"/>
             <w:shd w:fill="FFFFFF"/>
             <w:tcMar>
-              <w:top w:w="80" w:type="dxa"/>
-              <w:bottom w:w="80" w:type="dxa"/>
+              <w:top w:w="100" w:type="dxa"/>
+              <w:bottom w:w="100" w:type="dxa"/>
               <w:left w:w="130" w:type="dxa"/>
               <w:right w:w="130" w:type="dxa"/>
             </w:tcMar>
             <w:tcBorders>
               <w:top w:val="single" w:sz="4" w:space="0" w:color="D9B2B2"/>
-              <w:left w:val="single" w:sz="4" w:space="0" w:color="D9B2B2"/>
+              <w:left w:val="none"/>
               <w:bottom w:val="single" w:sz="4" w:space="0" w:color="D9B2B2"/>
-              <w:right w:val="single" w:sz="4" w:space="0" w:color="D9B2B2"/>
+              <w:right w:val="none"/>
             </w:tcBorders>
           </w:tcPr>
           <w:p>
             <w:pPr>
-              <w:spacing w:before="0" w:after="0" w:line="288" w:lineRule="auto"/>
-              <w:jc w:val="left"/>
+              <w:spacing w:before="0" w:after="0" w:line="276" w:lineRule="auto"/>
             </w:pPr>
             <w:r>
               <w:rPr>
                 <w:rFonts w:ascii="Calibri" w:hAnsi="Calibri"/>
-                <w:color w:val="232832"/>
-                <w:sz w:val="19"/>
+                <w:color w:val="232323"/>
+                <w:sz w:val="20"/>
               </w:rPr>
-              <w:t>Constructed a gravity waterworks system using clay pipes and stones to supply fresh water to Dapitan; installed public coconut oil street lighting; constructed a relief map of Mindanao in the town plaza.</w:t>
-            </w:r>
-          </w:p>
-        </w:tc>
-      </w:tr>
-      <w:tr>
-        <w:tc>
-          <w:tcPr>
-            <w:tcW w:type="dxa" w:w="2880"/>
-            <w:shd w:fill="FAF5F5"/>
-            <w:tcMar>
-              <w:top w:w="80" w:type="dxa"/>
-              <w:bottom w:w="80" w:type="dxa"/>
-              <w:left w:w="130" w:type="dxa"/>
-              <w:right w:w="130" w:type="dxa"/>
-            </w:tcMar>
-            <w:tcBorders>
-              <w:top w:val="single" w:sz="4" w:space="0" w:color="D9B2B2"/>
-              <w:left w:val="single" w:sz="4" w:space="0" w:color="D9B2B2"/>
-              <w:bottom w:val="single" w:sz="4" w:space="0" w:color="D9B2B2"/>
-              <w:right w:val="single" w:sz="4" w:space="0" w:color="D9B2B2"/>
-            </w:tcBorders>
-          </w:tcPr>
-          <w:p>
-            <w:pPr>
-              <w:spacing w:before="0" w:after="0" w:line="288" w:lineRule="auto"/>
-              <w:jc w:val="left"/>
-            </w:pPr>
-            <w:r>
-              <w:rPr>
-                <w:rFonts w:ascii="Calibri" w:hAnsi="Calibri"/>
-                <w:color w:val="232832"/>
-                <w:sz w:val="19"/>
-              </w:rPr>
-              <w:t>Science &amp; Biodiversity</w:t>
-            </w:r>
-          </w:p>
-        </w:tc>
-        <w:tc>
-          <w:tcPr>
-            <w:tcW w:type="dxa" w:w="6480"/>
-            <w:shd w:fill="FAF5F5"/>
-            <w:tcMar>
-              <w:top w:w="80" w:type="dxa"/>
-              <w:bottom w:w="80" w:type="dxa"/>
-              <w:left w:w="130" w:type="dxa"/>
-              <w:right w:w="130" w:type="dxa"/>
-            </w:tcMar>
-            <w:tcBorders>
-              <w:top w:val="single" w:sz="4" w:space="0" w:color="D9B2B2"/>
-              <w:left w:val="single" w:sz="4" w:space="0" w:color="D9B2B2"/>
-              <w:bottom w:val="single" w:sz="4" w:space="0" w:color="D9B2B2"/>
-              <w:right w:val="single" w:sz="4" w:space="0" w:color="D9B2B2"/>
-            </w:tcBorders>
-          </w:tcPr>
-          <w:p>
-            <w:pPr>
-              <w:spacing w:before="0" w:after="0" w:line="288" w:lineRule="auto"/>
-              <w:jc w:val="left"/>
-            </w:pPr>
-            <w:r>
-              <w:rPr>
-                <w:rFonts w:ascii="Calibri" w:hAnsi="Calibri"/>
-                <w:color w:val="232832"/>
-                <w:sz w:val="19"/>
-              </w:rPr>
-              <w:t>Collected animal, insect, and plant specimens sent to European museums; discovered three new animal species named in his honor: Draco rizali (flying lizard), Apogonia rizali (small beetle), and Rhacophorus rizali (tree frog).</w:t>
+              <w:t>Urgent necessity; commanded armed revolutionary forces and declared Philippine independence in Kawit (1898)</w:t>
             </w:r>
           </w:p>
         </w:tc>
@@ -2683,29 +2938,29 @@
     </w:tbl>
     <w:p>
       <w:pPr>
-        <w:spacing w:before="0" w:after="80" w:line="312" w:lineRule="auto"/>
+        <w:spacing w:before="0" w:after="80" w:line="300" w:lineRule="auto"/>
       </w:pPr>
       <w:r>
         <w:rPr>
           <w:rFonts w:ascii="Calibri" w:hAnsi="Calibri"/>
           <w:b/>
-          <w:color w:val="191E28"/>
+          <w:color w:val="1E1E1E"/>
           <w:sz w:val="22"/>
         </w:rPr>
-        <w:t xml:space="preserve">Crucial Facts: </w:t>
+        <w:t xml:space="preserve">Mabini's Synthesis: </w:t>
       </w:r>
       <w:r>
         <w:rPr>
           <w:rFonts w:ascii="Calibri" w:hAnsi="Calibri"/>
-          <w:color w:val="232832"/>
+          <w:color w:val="323232"/>
           <w:sz w:val="22"/>
         </w:rPr>
-        <w:t>Key Events During Exile to Remember for Exams:</w:t>
+        <w:t>Rizal vs. Apolinario Mabini (The Brains of the Revolution):</w:t>
       </w:r>
     </w:p>
     <w:p>
       <w:pPr>
-        <w:spacing w:before="0" w:after="80" w:line="312" w:lineRule="auto"/>
+        <w:spacing w:before="0" w:after="80" w:line="300" w:lineRule="auto"/>
         <w:ind w:left="360"/>
       </w:pPr>
       <w:r>
@@ -2713,22 +2968,22 @@
           <w:rFonts w:ascii="Calibri" w:hAnsi="Calibri"/>
           <w:b/>
           <w:color w:val="7A1C1C"/>
-          <w:sz w:val="22"/>
+          <w:sz w:val="20"/>
         </w:rPr>
-        <w:t xml:space="preserve">•  </w:t>
+        <w:t xml:space="preserve">▪  </w:t>
       </w:r>
       <w:r>
         <w:rPr>
           <w:rFonts w:ascii="Calibri" w:hAnsi="Calibri"/>
-          <w:color w:val="232832"/>
+          <w:color w:val="323232"/>
           <w:sz w:val="22"/>
         </w:rPr>
-        <w:t>Josephine Bracken arrived in Dapitan in 1895 accompanying her blind adoptive father, George Taufer. She and Rizal fell in love and lived as husband and wife. She later returned to Hong Kong after Rizal's death, remarried, had a child, and died of tuberculosis at age 25.</w:t>
+        <w:t>Apolinario Mabini shared Rizal's intellectual ideals, European Enlightenment philosophy, and belief in constitutional democracy.</w:t>
       </w:r>
     </w:p>
     <w:p>
       <w:pPr>
-        <w:spacing w:before="0" w:after="80" w:line="312" w:lineRule="auto"/>
+        <w:spacing w:before="0" w:after="80" w:line="300" w:lineRule="auto"/>
         <w:ind w:left="360"/>
       </w:pPr>
       <w:r>
@@ -2736,22 +2991,22 @@
           <w:rFonts w:ascii="Calibri" w:hAnsi="Calibri"/>
           <w:b/>
           <w:color w:val="7A1C1C"/>
-          <w:sz w:val="22"/>
+          <w:sz w:val="20"/>
         </w:rPr>
-        <w:t xml:space="preserve">•  </w:t>
+        <w:t xml:space="preserve">▪  </w:t>
       </w:r>
       <w:r>
         <w:rPr>
           <w:rFonts w:ascii="Calibri" w:hAnsi="Calibri"/>
-          <w:color w:val="232832"/>
+          <w:color w:val="323232"/>
           <w:sz w:val="22"/>
         </w:rPr>
-        <w:t>Dr. Pio Valenzuela was dispatched by Andres Bonifacio to Dapitan in June 1896 to seek Rizal's blessing and offer an escape rescue plan.</w:t>
+        <w:t>However, Mabini differed from Rizal by embracing armed revolution as a necessary reality when all avenues of peaceful petition had been exhausted.</w:t>
       </w:r>
     </w:p>
     <w:p>
       <w:pPr>
-        <w:spacing w:before="0" w:after="80" w:line="312" w:lineRule="auto"/>
+        <w:spacing w:before="0" w:after="80" w:line="300" w:lineRule="auto"/>
         <w:ind w:left="360"/>
       </w:pPr>
       <w:r>
@@ -2759,40 +3014,17 @@
           <w:rFonts w:ascii="Calibri" w:hAnsi="Calibri"/>
           <w:b/>
           <w:color w:val="7A1C1C"/>
-          <w:sz w:val="22"/>
+          <w:sz w:val="20"/>
         </w:rPr>
-        <w:t xml:space="preserve">•  </w:t>
+        <w:t xml:space="preserve">▪  </w:t>
       </w:r>
       <w:r>
         <w:rPr>
           <w:rFonts w:ascii="Calibri" w:hAnsi="Calibri"/>
-          <w:color w:val="232832"/>
+          <w:color w:val="323232"/>
           <w:sz w:val="22"/>
         </w:rPr>
-        <w:t>Rizal rejected the Katipunan rescue plan and premature uprising because the revolutionaries had insufficient firearms, lacked military training, and would lead to unnecessary civilian slaughter.</w:t>
-      </w:r>
-    </w:p>
-    <w:p>
-      <w:pPr>
-        <w:spacing w:before="0" w:after="80" w:line="312" w:lineRule="auto"/>
-        <w:ind w:left="360"/>
-      </w:pPr>
-      <w:r>
-        <w:rPr>
-          <w:rFonts w:ascii="Calibri" w:hAnsi="Calibri"/>
-          <w:b/>
-          <w:color w:val="7A1C1C"/>
-          <w:sz w:val="22"/>
-        </w:rPr>
-        <w:t xml:space="preserve">•  </w:t>
-      </w:r>
-      <w:r>
-        <w:rPr>
-          <w:rFonts w:ascii="Calibri" w:hAnsi="Calibri"/>
-          <w:color w:val="232832"/>
-          <w:sz w:val="22"/>
-        </w:rPr>
-        <w:t>Governor-General Ramon Blanco approved Rizal's application to volunteer as a military surgeon in Cuba during the yellow fever epidemic, which allowed Rizal to leave Dapitan on July 31, 1896.</w:t>
+        <w:t>Mabini became the primary legal and constitutional architect of Aguinaldo's revolutionary government.</w:t>
       </w:r>
     </w:p>
     <w:p>
@@ -2840,7 +3072,7 @@
                 <w:color w:val="FFFFFF"/>
                 <w:sz w:val="25"/>
               </w:rPr>
-              <w:t>TOPIC 4: TRIAL, MARTYRDOM, AND IMPACT (1896)</w:t>
+              <w:t>TOPIC 4: RIZAL'S EXILE, TRIAL, AND EXECUTION (04 HANDOUT 1A)</w:t>
             </w:r>
           </w:p>
         </w:tc>
@@ -2853,15 +3085,474 @@
     </w:p>
     <w:p>
       <w:pPr>
-        <w:spacing w:before="0" w:after="80" w:line="312" w:lineRule="auto"/>
+        <w:spacing w:before="0" w:after="80" w:line="300" w:lineRule="auto"/>
       </w:pPr>
       <w:r>
         <w:rPr>
           <w:rFonts w:ascii="Calibri" w:hAnsi="Calibri"/>
-          <w:color w:val="232832"/>
+          <w:color w:val="323232"/>
           <w:sz w:val="22"/>
         </w:rPr>
-        <w:t>While en route to Cuba, the Katipunan revolution erupted in Manila (August 1896). Rizal was arrested aboard the ship Isla de Panay, brought to Barcelona, and sent back as a prisoner to Fort Santiago, Manila.</w:t>
+        <w:t>Rizal spent four years and fourteen days in exile in Dapitan, Zamboanga del Norte (July 17, 1892 – July 31, 1896). Rather than giving up, he transformed the town into an exemplary model of progressive civic development.</w:t>
+      </w:r>
+    </w:p>
+    <w:tbl>
+      <w:tblPr>
+        <w:tblW w:type="auto" w:w="0"/>
+        <w:jc w:val="center"/>
+        <w:tblLayout w:type="fixed"/>
+        <w:tblLook w:firstColumn="1" w:firstRow="1" w:lastColumn="0" w:lastRow="0" w:noHBand="0" w:noVBand="1" w:val="04A0"/>
+      </w:tblPr>
+      <w:tblGrid>
+        <w:gridCol w:w="4680"/>
+        <w:gridCol w:w="4680"/>
+      </w:tblGrid>
+      <w:tr>
+        <w:tc>
+          <w:tcPr>
+            <w:tcW w:type="dxa" w:w="2880"/>
+            <w:shd w:fill="7A1C1C"/>
+            <w:tcMar>
+              <w:top w:w="120" w:type="dxa"/>
+              <w:bottom w:w="120" w:type="dxa"/>
+              <w:left w:w="140" w:type="dxa"/>
+              <w:right w:w="140" w:type="dxa"/>
+            </w:tcMar>
+          </w:tcPr>
+          <w:p>
+            <w:pPr>
+              <w:spacing w:before="0" w:after="0" w:line="276" w:lineRule="auto"/>
+            </w:pPr>
+            <w:r>
+              <w:rPr>
+                <w:rFonts w:ascii="Calibri" w:hAnsi="Calibri"/>
+                <w:b/>
+                <w:color w:val="FFFFFF"/>
+                <w:sz w:val="21"/>
+              </w:rPr>
+              <w:t>Field of Contribution</w:t>
+            </w:r>
+          </w:p>
+        </w:tc>
+        <w:tc>
+          <w:tcPr>
+            <w:tcW w:type="dxa" w:w="6480"/>
+            <w:shd w:fill="7A1C1C"/>
+            <w:tcMar>
+              <w:top w:w="120" w:type="dxa"/>
+              <w:bottom w:w="120" w:type="dxa"/>
+              <w:left w:w="140" w:type="dxa"/>
+              <w:right w:w="140" w:type="dxa"/>
+            </w:tcMar>
+          </w:tcPr>
+          <w:p>
+            <w:pPr>
+              <w:spacing w:before="0" w:after="0" w:line="276" w:lineRule="auto"/>
+            </w:pPr>
+            <w:r>
+              <w:rPr>
+                <w:rFonts w:ascii="Calibri" w:hAnsi="Calibri"/>
+                <w:b/>
+                <w:color w:val="FFFFFF"/>
+                <w:sz w:val="21"/>
+              </w:rPr>
+              <w:t>Concrete Community Achievements in Dapitan</w:t>
+            </w:r>
+          </w:p>
+        </w:tc>
+      </w:tr>
+      <w:tr>
+        <w:tc>
+          <w:tcPr>
+            <w:tcW w:type="dxa" w:w="2880"/>
+            <w:shd w:fill="FFFFFF"/>
+            <w:tcMar>
+              <w:top w:w="100" w:type="dxa"/>
+              <w:bottom w:w="100" w:type="dxa"/>
+              <w:left w:w="130" w:type="dxa"/>
+              <w:right w:w="130" w:type="dxa"/>
+            </w:tcMar>
+            <w:tcBorders>
+              <w:top w:val="single" w:sz="4" w:space="0" w:color="D9B2B2"/>
+              <w:left w:val="none"/>
+              <w:bottom w:val="single" w:sz="4" w:space="0" w:color="D9B2B2"/>
+              <w:right w:val="none"/>
+            </w:tcBorders>
+          </w:tcPr>
+          <w:p>
+            <w:pPr>
+              <w:spacing w:before="0" w:after="0" w:line="276" w:lineRule="auto"/>
+            </w:pPr>
+            <w:r>
+              <w:rPr>
+                <w:rFonts w:ascii="Calibri" w:hAnsi="Calibri"/>
+                <w:color w:val="232323"/>
+                <w:sz w:val="20"/>
+              </w:rPr>
+              <w:t>Medicine &amp; Surgery</w:t>
+            </w:r>
+          </w:p>
+        </w:tc>
+        <w:tc>
+          <w:tcPr>
+            <w:tcW w:type="dxa" w:w="6480"/>
+            <w:shd w:fill="FFFFFF"/>
+            <w:tcMar>
+              <w:top w:w="100" w:type="dxa"/>
+              <w:bottom w:w="100" w:type="dxa"/>
+              <w:left w:w="130" w:type="dxa"/>
+              <w:right w:w="130" w:type="dxa"/>
+            </w:tcMar>
+            <w:tcBorders>
+              <w:top w:val="single" w:sz="4" w:space="0" w:color="D9B2B2"/>
+              <w:left w:val="none"/>
+              <w:bottom w:val="single" w:sz="4" w:space="0" w:color="D9B2B2"/>
+              <w:right w:val="none"/>
+            </w:tcBorders>
+          </w:tcPr>
+          <w:p>
+            <w:pPr>
+              <w:spacing w:before="0" w:after="0" w:line="276" w:lineRule="auto"/>
+            </w:pPr>
+            <w:r>
+              <w:rPr>
+                <w:rFonts w:ascii="Calibri" w:hAnsi="Calibri"/>
+                <w:color w:val="232323"/>
+                <w:sz w:val="20"/>
+              </w:rPr>
+              <w:t>Provided free consultations and medicines to impoverished locals; operated successfully on his mother Teodora Alonso's cataracts; treated domestic and international patients.</w:t>
+            </w:r>
+          </w:p>
+        </w:tc>
+      </w:tr>
+      <w:tr>
+        <w:tc>
+          <w:tcPr>
+            <w:tcW w:type="dxa" w:w="2880"/>
+            <w:shd w:fill="FDF7F7"/>
+            <w:tcMar>
+              <w:top w:w="100" w:type="dxa"/>
+              <w:bottom w:w="100" w:type="dxa"/>
+              <w:left w:w="130" w:type="dxa"/>
+              <w:right w:w="130" w:type="dxa"/>
+            </w:tcMar>
+            <w:tcBorders>
+              <w:top w:val="single" w:sz="4" w:space="0" w:color="D9B2B2"/>
+              <w:left w:val="none"/>
+              <w:bottom w:val="single" w:sz="4" w:space="0" w:color="D9B2B2"/>
+              <w:right w:val="none"/>
+            </w:tcBorders>
+          </w:tcPr>
+          <w:p>
+            <w:pPr>
+              <w:spacing w:before="0" w:after="0" w:line="276" w:lineRule="auto"/>
+            </w:pPr>
+            <w:r>
+              <w:rPr>
+                <w:rFonts w:ascii="Calibri" w:hAnsi="Calibri"/>
+                <w:color w:val="232323"/>
+                <w:sz w:val="20"/>
+              </w:rPr>
+              <w:t>Education &amp; Teaching</w:t>
+            </w:r>
+          </w:p>
+        </w:tc>
+        <w:tc>
+          <w:tcPr>
+            <w:tcW w:type="dxa" w:w="6480"/>
+            <w:shd w:fill="FDF7F7"/>
+            <w:tcMar>
+              <w:top w:w="100" w:type="dxa"/>
+              <w:bottom w:w="100" w:type="dxa"/>
+              <w:left w:w="130" w:type="dxa"/>
+              <w:right w:w="130" w:type="dxa"/>
+            </w:tcMar>
+            <w:tcBorders>
+              <w:top w:val="single" w:sz="4" w:space="0" w:color="D9B2B2"/>
+              <w:left w:val="none"/>
+              <w:bottom w:val="single" w:sz="4" w:space="0" w:color="D9B2B2"/>
+              <w:right w:val="none"/>
+            </w:tcBorders>
+          </w:tcPr>
+          <w:p>
+            <w:pPr>
+              <w:spacing w:before="0" w:after="0" w:line="276" w:lineRule="auto"/>
+            </w:pPr>
+            <w:r>
+              <w:rPr>
+                <w:rFonts w:ascii="Calibri" w:hAnsi="Calibri"/>
+                <w:color w:val="232323"/>
+                <w:sz w:val="20"/>
+              </w:rPr>
+              <w:t>Built a boys' school on his Talisay property; trained 16 young boys in academic subjects (English, Spanish, arithmetic), sports (swimming, gymnastics), and vocational skills without tuition fees.</w:t>
+            </w:r>
+          </w:p>
+        </w:tc>
+      </w:tr>
+      <w:tr>
+        <w:tc>
+          <w:tcPr>
+            <w:tcW w:type="dxa" w:w="2880"/>
+            <w:shd w:fill="FFFFFF"/>
+            <w:tcMar>
+              <w:top w:w="100" w:type="dxa"/>
+              <w:bottom w:w="100" w:type="dxa"/>
+              <w:left w:w="130" w:type="dxa"/>
+              <w:right w:w="130" w:type="dxa"/>
+            </w:tcMar>
+            <w:tcBorders>
+              <w:top w:val="single" w:sz="4" w:space="0" w:color="D9B2B2"/>
+              <w:left w:val="none"/>
+              <w:bottom w:val="single" w:sz="4" w:space="0" w:color="D9B2B2"/>
+              <w:right w:val="none"/>
+            </w:tcBorders>
+          </w:tcPr>
+          <w:p>
+            <w:pPr>
+              <w:spacing w:before="0" w:after="0" w:line="276" w:lineRule="auto"/>
+            </w:pPr>
+            <w:r>
+              <w:rPr>
+                <w:rFonts w:ascii="Calibri" w:hAnsi="Calibri"/>
+                <w:color w:val="232323"/>
+                <w:sz w:val="20"/>
+              </w:rPr>
+              <w:t>Engineering &amp; Public Works</w:t>
+            </w:r>
+          </w:p>
+        </w:tc>
+        <w:tc>
+          <w:tcPr>
+            <w:tcW w:type="dxa" w:w="6480"/>
+            <w:shd w:fill="FFFFFF"/>
+            <w:tcMar>
+              <w:top w:w="100" w:type="dxa"/>
+              <w:bottom w:w="100" w:type="dxa"/>
+              <w:left w:w="130" w:type="dxa"/>
+              <w:right w:w="130" w:type="dxa"/>
+            </w:tcMar>
+            <w:tcBorders>
+              <w:top w:val="single" w:sz="4" w:space="0" w:color="D9B2B2"/>
+              <w:left w:val="none"/>
+              <w:bottom w:val="single" w:sz="4" w:space="0" w:color="D9B2B2"/>
+              <w:right w:val="none"/>
+            </w:tcBorders>
+          </w:tcPr>
+          <w:p>
+            <w:pPr>
+              <w:spacing w:before="0" w:after="0" w:line="276" w:lineRule="auto"/>
+            </w:pPr>
+            <w:r>
+              <w:rPr>
+                <w:rFonts w:ascii="Calibri" w:hAnsi="Calibri"/>
+                <w:color w:val="232323"/>
+                <w:sz w:val="20"/>
+              </w:rPr>
+              <w:t>Constructed a gravity waterworks system using clay pipes and stones to supply fresh water to Dapitan; installed public coconut oil street lighting; constructed a relief map of Mindanao in the town plaza.</w:t>
+            </w:r>
+          </w:p>
+        </w:tc>
+      </w:tr>
+      <w:tr>
+        <w:tc>
+          <w:tcPr>
+            <w:tcW w:type="dxa" w:w="2880"/>
+            <w:shd w:fill="FDF7F7"/>
+            <w:tcMar>
+              <w:top w:w="100" w:type="dxa"/>
+              <w:bottom w:w="100" w:type="dxa"/>
+              <w:left w:w="130" w:type="dxa"/>
+              <w:right w:w="130" w:type="dxa"/>
+            </w:tcMar>
+            <w:tcBorders>
+              <w:top w:val="single" w:sz="4" w:space="0" w:color="D9B2B2"/>
+              <w:left w:val="none"/>
+              <w:bottom w:val="single" w:sz="4" w:space="0" w:color="D9B2B2"/>
+              <w:right w:val="none"/>
+            </w:tcBorders>
+          </w:tcPr>
+          <w:p>
+            <w:pPr>
+              <w:spacing w:before="0" w:after="0" w:line="276" w:lineRule="auto"/>
+            </w:pPr>
+            <w:r>
+              <w:rPr>
+                <w:rFonts w:ascii="Calibri" w:hAnsi="Calibri"/>
+                <w:color w:val="232323"/>
+                <w:sz w:val="20"/>
+              </w:rPr>
+              <w:t>Science &amp; Biodiversity</w:t>
+            </w:r>
+          </w:p>
+        </w:tc>
+        <w:tc>
+          <w:tcPr>
+            <w:tcW w:type="dxa" w:w="6480"/>
+            <w:shd w:fill="FDF7F7"/>
+            <w:tcMar>
+              <w:top w:w="100" w:type="dxa"/>
+              <w:bottom w:w="100" w:type="dxa"/>
+              <w:left w:w="130" w:type="dxa"/>
+              <w:right w:w="130" w:type="dxa"/>
+            </w:tcMar>
+            <w:tcBorders>
+              <w:top w:val="single" w:sz="4" w:space="0" w:color="D9B2B2"/>
+              <w:left w:val="none"/>
+              <w:bottom w:val="single" w:sz="4" w:space="0" w:color="D9B2B2"/>
+              <w:right w:val="none"/>
+            </w:tcBorders>
+          </w:tcPr>
+          <w:p>
+            <w:pPr>
+              <w:spacing w:before="0" w:after="0" w:line="276" w:lineRule="auto"/>
+            </w:pPr>
+            <w:r>
+              <w:rPr>
+                <w:rFonts w:ascii="Calibri" w:hAnsi="Calibri"/>
+                <w:color w:val="232323"/>
+                <w:sz w:val="20"/>
+              </w:rPr>
+              <w:t>Collected animal, insect, and plant specimens sent to European museums; discovered three new animal species named in his honor: Draco rizali (flying lizard), Apogonia rizali (small beetle), and Rhacophorus rizali (tree frog).</w:t>
+            </w:r>
+          </w:p>
+        </w:tc>
+      </w:tr>
+    </w:tbl>
+    <w:p>
+      <w:pPr>
+        <w:spacing w:before="0" w:after="80" w:line="300" w:lineRule="auto"/>
+      </w:pPr>
+      <w:r>
+        <w:rPr>
+          <w:rFonts w:ascii="Calibri" w:hAnsi="Calibri"/>
+          <w:b/>
+          <w:color w:val="1E1E1E"/>
+          <w:sz w:val="22"/>
+        </w:rPr>
+        <w:t xml:space="preserve">Crucial Facts: </w:t>
+      </w:r>
+      <w:r>
+        <w:rPr>
+          <w:rFonts w:ascii="Calibri" w:hAnsi="Calibri"/>
+          <w:color w:val="323232"/>
+          <w:sz w:val="22"/>
+        </w:rPr>
+        <w:t>Key Events in Dapitan and Transition to Trial:</w:t>
+      </w:r>
+    </w:p>
+    <w:p>
+      <w:pPr>
+        <w:spacing w:before="0" w:after="80" w:line="300" w:lineRule="auto"/>
+        <w:ind w:left="360"/>
+      </w:pPr>
+      <w:r>
+        <w:rPr>
+          <w:rFonts w:ascii="Calibri" w:hAnsi="Calibri"/>
+          <w:b/>
+          <w:color w:val="7A1C1C"/>
+          <w:sz w:val="20"/>
+        </w:rPr>
+        <w:t xml:space="preserve">▪  </w:t>
+      </w:r>
+      <w:r>
+        <w:rPr>
+          <w:rFonts w:ascii="Calibri" w:hAnsi="Calibri"/>
+          <w:color w:val="323232"/>
+          <w:sz w:val="22"/>
+        </w:rPr>
+        <w:t>Josephine Bracken arrived in Dapitan in 1895 accompanying her blind adoptive father, George Taufer. She and Rizal fell in love and lived as husband and wife.</w:t>
+      </w:r>
+    </w:p>
+    <w:p>
+      <w:pPr>
+        <w:spacing w:before="0" w:after="80" w:line="300" w:lineRule="auto"/>
+        <w:ind w:left="360"/>
+      </w:pPr>
+      <w:r>
+        <w:rPr>
+          <w:rFonts w:ascii="Calibri" w:hAnsi="Calibri"/>
+          <w:b/>
+          <w:color w:val="7A1C1C"/>
+          <w:sz w:val="20"/>
+        </w:rPr>
+        <w:t xml:space="preserve">▪  </w:t>
+      </w:r>
+      <w:r>
+        <w:rPr>
+          <w:rFonts w:ascii="Calibri" w:hAnsi="Calibri"/>
+          <w:color w:val="323232"/>
+          <w:sz w:val="22"/>
+        </w:rPr>
+        <w:t>Dr. Pio Valenzuela visited Dapitan in June 1896 disguised as an eye patient's companion to seek Rizal's blessing and offer an escape plan.</w:t>
+      </w:r>
+    </w:p>
+    <w:p>
+      <w:pPr>
+        <w:spacing w:before="0" w:after="80" w:line="300" w:lineRule="auto"/>
+        <w:ind w:left="360"/>
+      </w:pPr>
+      <w:r>
+        <w:rPr>
+          <w:rFonts w:ascii="Calibri" w:hAnsi="Calibri"/>
+          <w:b/>
+          <w:color w:val="7A1C1C"/>
+          <w:sz w:val="20"/>
+        </w:rPr>
+        <w:t xml:space="preserve">▪  </w:t>
+      </w:r>
+      <w:r>
+        <w:rPr>
+          <w:rFonts w:ascii="Calibri" w:hAnsi="Calibri"/>
+          <w:color w:val="323232"/>
+          <w:sz w:val="22"/>
+        </w:rPr>
+        <w:t>Rizal rejected the uprising as premature: the Katipunan had insufficient firearms, no foreign alliances, and lacked tactical naval support.</w:t>
+      </w:r>
+    </w:p>
+    <w:p>
+      <w:pPr>
+        <w:spacing w:before="0" w:after="80" w:line="300" w:lineRule="auto"/>
+        <w:ind w:left="360"/>
+      </w:pPr>
+      <w:r>
+        <w:rPr>
+          <w:rFonts w:ascii="Calibri" w:hAnsi="Calibri"/>
+          <w:b/>
+          <w:color w:val="7A1C1C"/>
+          <w:sz w:val="20"/>
+        </w:rPr>
+        <w:t xml:space="preserve">▪  </w:t>
+      </w:r>
+      <w:r>
+        <w:rPr>
+          <w:rFonts w:ascii="Calibri" w:hAnsi="Calibri"/>
+          <w:color w:val="323232"/>
+          <w:sz w:val="22"/>
+        </w:rPr>
+        <w:t>Governor-General Ramon Blanco approved Rizal's application to volunteer as a military surgeon in Cuba during the yellow fever epidemic.</w:t>
+      </w:r>
+    </w:p>
+    <w:p>
+      <w:pPr>
+        <w:spacing w:before="0" w:after="80" w:line="300" w:lineRule="auto"/>
+        <w:ind w:left="360"/>
+      </w:pPr>
+      <w:r>
+        <w:rPr>
+          <w:rFonts w:ascii="Calibri" w:hAnsi="Calibri"/>
+          <w:b/>
+          <w:color w:val="7A1C1C"/>
+          <w:sz w:val="20"/>
+        </w:rPr>
+        <w:t xml:space="preserve">▪  </w:t>
+      </w:r>
+      <w:r>
+        <w:rPr>
+          <w:rFonts w:ascii="Calibri" w:hAnsi="Calibri"/>
+          <w:color w:val="323232"/>
+          <w:sz w:val="22"/>
+        </w:rPr>
+        <w:t>Rizal departed Dapitan on July 31, 1896. While en route, the revolution broke out in Manila, leading to his arrest aboard Isla de Panay.</w:t>
       </w:r>
     </w:p>
     <w:tbl>
@@ -2909,10 +3600,10 @@
             <w:r>
               <w:rPr>
                 <w:rFonts w:ascii="Calibri" w:hAnsi="Calibri"/>
-                <w:color w:val="232832"/>
+                <w:color w:val="282828"/>
                 <w:sz w:val="21"/>
               </w:rPr>
-              <w:t>The military court-martial of Jose Rizal was fundamentally unfair because the tribunal relied strictly on unverified circumstantial evidence and coerced statements from Katipuneros, while denying Rizal the right to confront his accusers or retain independent legal counsel.</w:t>
+              <w:t>Rizal's court-martial on December 26, 1896 was fundamentally flawed: the military judges convicted him based on coerced testimony from captured Katipuneros and circumstantial letters, denying him the right to confront witnesses or choose civilian legal counsel.</w:t>
             </w:r>
           </w:p>
         </w:tc>
@@ -2925,29 +3616,29 @@
     </w:p>
     <w:p>
       <w:pPr>
-        <w:spacing w:before="0" w:after="80" w:line="312" w:lineRule="auto"/>
+        <w:spacing w:before="0" w:after="80" w:line="300" w:lineRule="auto"/>
       </w:pPr>
       <w:r>
         <w:rPr>
           <w:rFonts w:ascii="Calibri" w:hAnsi="Calibri"/>
           <w:b/>
-          <w:color w:val="191E28"/>
+          <w:color w:val="1E1E1E"/>
           <w:sz w:val="22"/>
         </w:rPr>
-        <w:t xml:space="preserve">Key Exam Details: </w:t>
+        <w:t xml:space="preserve">Execution Details: </w:t>
       </w:r>
       <w:r>
         <w:rPr>
           <w:rFonts w:ascii="Calibri" w:hAnsi="Calibri"/>
-          <w:color w:val="232832"/>
+          <w:color w:val="323232"/>
           <w:sz w:val="22"/>
         </w:rPr>
-        <w:t>Crucial Facts on Trial and Martyrdom:</w:t>
+        <w:t>Martyrdom at Bagumbayan:</w:t>
       </w:r>
     </w:p>
     <w:p>
       <w:pPr>
-        <w:spacing w:before="0" w:after="80" w:line="312" w:lineRule="auto"/>
+        <w:spacing w:before="0" w:after="80" w:line="300" w:lineRule="auto"/>
         <w:ind w:left="360"/>
       </w:pPr>
       <w:r>
@@ -2955,22 +3646,22 @@
           <w:rFonts w:ascii="Calibri" w:hAnsi="Calibri"/>
           <w:b/>
           <w:color w:val="7A1C1C"/>
-          <w:sz w:val="22"/>
+          <w:sz w:val="20"/>
         </w:rPr>
-        <w:t xml:space="preserve">•  </w:t>
+        <w:t xml:space="preserve">▪  </w:t>
       </w:r>
       <w:r>
         <w:rPr>
           <w:rFonts w:ascii="Calibri" w:hAnsi="Calibri"/>
-          <w:color w:val="232832"/>
+          <w:color w:val="323232"/>
           <w:sz w:val="22"/>
         </w:rPr>
-        <w:t>Governor-General Camilo de Polavieja replaced the moderate Ramon Blanco and signed Rizal's death warrant on December 28, 1896.</w:t>
+        <w:t>Governor-General Camilo de Polavieja signed Rizal's death verdict on December 28, 1896.</w:t>
       </w:r>
     </w:p>
     <w:p>
       <w:pPr>
-        <w:spacing w:before="0" w:after="80" w:line="312" w:lineRule="auto"/>
+        <w:spacing w:before="0" w:after="80" w:line="300" w:lineRule="auto"/>
         <w:ind w:left="360"/>
       </w:pPr>
       <w:r>
@@ -2978,22 +3669,22 @@
           <w:rFonts w:ascii="Calibri" w:hAnsi="Calibri"/>
           <w:b/>
           <w:color w:val="7A1C1C"/>
-          <w:sz w:val="22"/>
+          <w:sz w:val="20"/>
         </w:rPr>
-        <w:t xml:space="preserve">•  </w:t>
+        <w:t xml:space="preserve">▪  </w:t>
       </w:r>
       <w:r>
         <w:rPr>
           <w:rFonts w:ascii="Calibri" w:hAnsi="Calibri"/>
-          <w:color w:val="232832"/>
+          <w:color w:val="323232"/>
           <w:sz w:val="22"/>
         </w:rPr>
-        <w:t>Mi Ultimo Adios (My Last Farewell) was composed secretly in Fort Santiago on the eve of his execution. Rizal concealed the poem inside an ordinary household alcohol cooking lamp (cocinilla) and passed it to his sister Trinidad, whispering 'there is something inside.'</w:t>
+        <w:t>Rizal concealed his untitled final poem 'Mi Ultimo Adios' inside an ordinary alcohol cooking lamp (cocinilla) and passed it to his sister Trinidad.</w:t>
       </w:r>
     </w:p>
     <w:p>
       <w:pPr>
-        <w:spacing w:before="0" w:after="80" w:line="312" w:lineRule="auto"/>
+        <w:spacing w:before="0" w:after="80" w:line="300" w:lineRule="auto"/>
         <w:ind w:left="360"/>
       </w:pPr>
       <w:r>
@@ -3001,22 +3692,22 @@
           <w:rFonts w:ascii="Calibri" w:hAnsi="Calibri"/>
           <w:b/>
           <w:color w:val="7A1C1C"/>
-          <w:sz w:val="22"/>
+          <w:sz w:val="20"/>
         </w:rPr>
-        <w:t xml:space="preserve">•  </w:t>
+        <w:t xml:space="preserve">▪  </w:t>
       </w:r>
       <w:r>
         <w:rPr>
           <w:rFonts w:ascii="Calibri" w:hAnsi="Calibri"/>
-          <w:color w:val="232832"/>
+          <w:color w:val="323232"/>
           <w:sz w:val="22"/>
         </w:rPr>
-        <w:t>Execution Date: December 30, 1896 at 7:03 AM at Bagumbayan (Luneta).</w:t>
+        <w:t>On December 30, 1896 at 7:03 AM, Rizal was executed by firing squad at Bagumbayan (now Luneta).</w:t>
       </w:r>
     </w:p>
     <w:p>
       <w:pPr>
-        <w:spacing w:before="0" w:after="80" w:line="312" w:lineRule="auto"/>
+        <w:spacing w:before="0" w:after="80" w:line="300" w:lineRule="auto"/>
         <w:ind w:left="360"/>
       </w:pPr>
       <w:r>
@@ -3024,40 +3715,17 @@
           <w:rFonts w:ascii="Calibri" w:hAnsi="Calibri"/>
           <w:b/>
           <w:color w:val="7A1C1C"/>
-          <w:sz w:val="22"/>
+          <w:sz w:val="20"/>
         </w:rPr>
-        <w:t xml:space="preserve">•  </w:t>
+        <w:t xml:space="preserve">▪  </w:t>
       </w:r>
       <w:r>
         <w:rPr>
           <w:rFonts w:ascii="Calibri" w:hAnsi="Calibri"/>
-          <w:color w:val="232832"/>
+          <w:color w:val="323232"/>
           <w:sz w:val="22"/>
         </w:rPr>
-        <w:t>Defiance at Death: Rizal refused a blindfold, maintained a calm pulse of 70 bpm, and twisted his falling body so he would land facing the sky rather than face-down on the ground.</w:t>
-      </w:r>
-    </w:p>
-    <w:p>
-      <w:pPr>
-        <w:spacing w:before="0" w:after="80" w:line="312" w:lineRule="auto"/>
-        <w:ind w:left="360"/>
-      </w:pPr>
-      <w:r>
-        <w:rPr>
-          <w:rFonts w:ascii="Calibri" w:hAnsi="Calibri"/>
-          <w:b/>
-          <w:color w:val="7A1C1C"/>
-          <w:sz w:val="22"/>
-        </w:rPr>
-        <w:t xml:space="preserve">•  </w:t>
-      </w:r>
-      <w:r>
-        <w:rPr>
-          <w:rFonts w:ascii="Calibri" w:hAnsi="Calibri"/>
-          <w:color w:val="232832"/>
-          <w:sz w:val="22"/>
-        </w:rPr>
-        <w:t>Historical Significance: Rizal's death exposed the irreversible injustice of Spanish rule and united all Filipinos behind the revolution.</w:t>
+        <w:t>His normal pulse rate of 70 bpm right before execution proved his absolute calm and moral conviction.</w:t>
       </w:r>
     </w:p>
     <w:tbl>
@@ -3105,10 +3773,10 @@
             <w:r>
               <w:rPr>
                 <w:rFonts w:ascii="Calibri" w:hAnsi="Calibri"/>
-                <w:color w:val="232832"/>
+                <w:color w:val="282828"/>
                 <w:sz w:val="21"/>
               </w:rPr>
-              <w:t>The ordinary kerosene/alcohol cooking stove/lamp inside which Jose Rizal hid his final untitled masterpiece, 'Mi Ultimo Adios,' to prevent Spanish guards from discovering and confiscating it before his execution.</w:t>
+              <w:t>The household kerosene/alcohol cooking stove inside which Jose Rizal hid 'Mi Ultimo Adios' before his execution, ensuring his final revolutionary message reached the Filipino nation safely.</w:t>
             </w:r>
           </w:p>
         </w:tc>
@@ -3177,80 +3845,80 @@
     </w:p>
     <w:p>
       <w:pPr>
-        <w:spacing w:before="0" w:after="120" w:line="312" w:lineRule="auto"/>
+        <w:spacing w:before="0" w:after="120" w:line="300" w:lineRule="auto"/>
       </w:pPr>
       <w:r>
         <w:rPr>
           <w:rFonts w:ascii="Calibri" w:hAnsi="Calibri"/>
-          <w:color w:val="232832"/>
+          <w:color w:val="323232"/>
           <w:sz w:val="22"/>
         </w:rPr>
-        <w:t>1. What was the exact publication date of the first issue of La Solidaridad, and who served as its first editor in Barcelona?</w:t>
+        <w:t>1. What was the Propaganda Movement's primary newspaper in Spain, and what were its three main political goals?</w:t>
       </w:r>
     </w:p>
     <w:p>
       <w:pPr>
-        <w:spacing w:before="0" w:after="120" w:line="312" w:lineRule="auto"/>
+        <w:spacing w:before="0" w:after="120" w:line="300" w:lineRule="auto"/>
       </w:pPr>
       <w:r>
         <w:rPr>
           <w:rFonts w:ascii="Calibri" w:hAnsi="Calibri"/>
-          <w:color w:val="232832"/>
+          <w:color w:val="323232"/>
           <w:sz w:val="22"/>
         </w:rPr>
-        <w:t>2. Name the founder, date, and exact meeting venue of La Liga Filipina in Manila.</w:t>
+        <w:t>2. Where and when was La Liga Filipina founded, and into which two groups did it split following Rizal's arrest?</w:t>
       </w:r>
     </w:p>
     <w:p>
       <w:pPr>
-        <w:spacing w:before="0" w:after="120" w:line="312" w:lineRule="auto"/>
+        <w:spacing w:before="0" w:after="120" w:line="300" w:lineRule="auto"/>
       </w:pPr>
       <w:r>
         <w:rPr>
           <w:rFonts w:ascii="Calibri" w:hAnsi="Calibri"/>
-          <w:color w:val="232832"/>
+          <w:color w:val="323232"/>
           <w:sz w:val="22"/>
         </w:rPr>
-        <w:t>3. Which Katipunan emissary visited Rizal in Dapitan, and for what specific strategic reasons did Rizal reject the proposed uprising?</w:t>
+        <w:t>3. Define Filipinismo and explain why Rizal prioritized intellectual enlightenment and education over immediate armed revolt.</w:t>
       </w:r>
     </w:p>
     <w:p>
       <w:pPr>
-        <w:spacing w:before="0" w:after="120" w:line="312" w:lineRule="auto"/>
+        <w:spacing w:before="0" w:after="120" w:line="300" w:lineRule="auto"/>
       </w:pPr>
       <w:r>
         <w:rPr>
           <w:rFonts w:ascii="Calibri" w:hAnsi="Calibri"/>
-          <w:color w:val="232832"/>
+          <w:color w:val="323232"/>
           <w:sz w:val="22"/>
         </w:rPr>
-        <w:t>4. Which Spanish Governor-General offered Rizal clemency to serve as a military physician in Cuba?</w:t>
+        <w:t>4. Compare the revolutionary philosophies of Jose Rizal and Andres Bonifacio. Why did the Katipunan adopt 'Rizal' as a secret password?</w:t>
       </w:r>
     </w:p>
     <w:p>
       <w:pPr>
-        <w:spacing w:before="0" w:after="120" w:line="312" w:lineRule="auto"/>
+        <w:spacing w:before="0" w:after="120" w:line="300" w:lineRule="auto"/>
       </w:pPr>
       <w:r>
         <w:rPr>
           <w:rFonts w:ascii="Calibri" w:hAnsi="Calibri"/>
-          <w:color w:val="232832"/>
+          <w:color w:val="323232"/>
           <w:sz w:val="22"/>
         </w:rPr>
-        <w:t>5. What ordinary household item did Rizal use to conceal his farewell poem, 'Mi Ultimo Adios,' and to whom did he entrust it?</w:t>
+        <w:t>5. What were Rizal's major engineering and scientific achievements during his four-year exile in Dapitan?</w:t>
       </w:r>
     </w:p>
     <w:p>
       <w:pPr>
-        <w:spacing w:before="0" w:after="120" w:line="312" w:lineRule="auto"/>
+        <w:spacing w:before="0" w:after="120" w:line="300" w:lineRule="auto"/>
       </w:pPr>
       <w:r>
         <w:rPr>
           <w:rFonts w:ascii="Calibri" w:hAnsi="Calibri"/>
-          <w:color w:val="232832"/>
+          <w:color w:val="323232"/>
           <w:sz w:val="22"/>
         </w:rPr>
-        <w:t>6. Why is Rizal's military trial considered by historians as a blatant miscarriage of justice?</w:t>
+        <w:t>6. On what legal and procedural grounds do historians classify Rizal's military trial as a blatant miscarriage of justice?</w:t>
       </w:r>
     </w:p>
     <w:sectPr>

</xml_diff>